<commit_message>
Update portfolio content and credential previews
</commit_message>
<xml_diff>
--- a/AKILAN-RESUME.docx
+++ b/AKILAN-RESUME.docx
@@ -39,38 +39,112 @@
         </w:rPr>
         <w:t xml:space="preserve"> </w:t>
       </w:r>
+      <w:hyperlink r:id="rId5" w:history="1">
+        <w:r>
+          <w:rPr>
+            <w:rStyle w:val="Hyperlink"/>
+            <w:sz w:val="18"/>
+            <w:szCs w:val="18"/>
+          </w:rPr>
+          <w:t>linkedin.com/in</w:t>
+        </w:r>
+        <w:r>
+          <w:rPr>
+            <w:rStyle w:val="Hyperlink"/>
+            <w:sz w:val="18"/>
+            <w:szCs w:val="18"/>
+          </w:rPr>
+          <w:t>/</w:t>
+        </w:r>
+        <w:proofErr w:type="spellStart"/>
+        <w:r>
+          <w:rPr>
+            <w:rStyle w:val="Hyperlink"/>
+            <w:sz w:val="18"/>
+            <w:szCs w:val="18"/>
+          </w:rPr>
+          <w:t>akilanmanikandan</w:t>
+        </w:r>
+        <w:proofErr w:type="spellEnd"/>
+      </w:hyperlink>
       <w:r>
         <w:rPr>
           <w:color w:val="0070C0"/>
           <w:sz w:val="18"/>
           <w:szCs w:val="18"/>
         </w:rPr>
-        <w:t>linkedin.com/in/akilanmanikandan</w:t>
-      </w:r>
-      <w:r>
-        <w:rPr>
-          <w:color w:val="0070C0"/>
+        <w:t xml:space="preserve"> </w:t>
+      </w:r>
+      <w:r>
+        <w:rPr>
+          <w:color w:val="444444"/>
           <w:sz w:val="18"/>
           <w:szCs w:val="18"/>
         </w:rPr>
-        <w:t xml:space="preserve"> </w:t>
-      </w:r>
-      <w:r>
-        <w:rPr>
-          <w:color w:val="444444"/>
-          <w:sz w:val="18"/>
-          <w:szCs w:val="18"/>
-        </w:rPr>
         <w:t xml:space="preserve">•  </w:t>
       </w:r>
+      <w:hyperlink r:id="rId6" w:history="1">
+        <w:r>
+          <w:rPr>
+            <w:rStyle w:val="Hyperlink"/>
+            <w:sz w:val="18"/>
+            <w:szCs w:val="18"/>
+          </w:rPr>
+          <w:t>github.com</w:t>
+        </w:r>
+        <w:r>
+          <w:rPr>
+            <w:rStyle w:val="Hyperlink"/>
+            <w:sz w:val="18"/>
+            <w:szCs w:val="18"/>
+          </w:rPr>
+          <w:t>/</w:t>
+        </w:r>
+        <w:proofErr w:type="spellStart"/>
+        <w:r>
+          <w:rPr>
+            <w:rStyle w:val="Hyperlink"/>
+            <w:sz w:val="18"/>
+            <w:szCs w:val="18"/>
+          </w:rPr>
+          <w:t>akilanmanikandan</w:t>
+        </w:r>
+        <w:proofErr w:type="spellEnd"/>
+        <w:r>
+          <w:rPr>
+            <w:rStyle w:val="Hyperlink"/>
+            <w:sz w:val="18"/>
+            <w:szCs w:val="18"/>
+          </w:rPr>
+          <w:t xml:space="preserve"> </w:t>
+        </w:r>
+      </w:hyperlink>
       <w:r>
         <w:rPr>
           <w:color w:val="2E75B6"/>
           <w:sz w:val="18"/>
           <w:szCs w:val="18"/>
         </w:rPr>
-        <w:t>github.com/akilanmanikandan</w:t>
-      </w:r>
+        <w:t xml:space="preserve"> </w:t>
+      </w:r>
+      <w:r>
+        <w:rPr>
+          <w:color w:val="444444"/>
+          <w:sz w:val="18"/>
+          <w:szCs w:val="18"/>
+        </w:rPr>
+        <w:t xml:space="preserve">•  </w:t>
+      </w:r>
+      <w:hyperlink r:id="rId7" w:history="1">
+        <w:r>
+          <w:rPr>
+            <w:rStyle w:val="Hyperlink"/>
+            <w:sz w:val="18"/>
+            <w:szCs w:val="18"/>
+          </w:rPr>
+          <w:t>akilanmanikandan.me</w:t>
+        </w:r>
+      </w:hyperlink>
     </w:p>
     <w:p>
       <w:pPr>
@@ -95,7 +169,23 @@
         <w:spacing w:before="60" w:after="60"/>
       </w:pPr>
       <w:r>
-        <w:t>Backend and automation engineer with 1+ year of internship experience building production-grade API services, workflow automation pipelines, and data ingestion systems. Proficient in Python, Java, TypeScript, and SQL, with hands-on delivery across FastAPI, Spring Boot, Django REST Framework, NestJS, PostgreSQL, and MongoDB. Demonstrated ability to own features end-to-end — from schema design and API implementation to deployment and monitoring. Adept at converting repetitive operational processes into reliable, configuration-driven systems with full audit trails.</w:t>
+        <w:t xml:space="preserve">Backend and automation engineer with 1+ year of internship experience building production-grade API services, workflow automation pipelines, and data ingestion systems. Proficient in Python, Java, TypeScript, and SQL, with hands-on delivery across </w:t>
+      </w:r>
+      <w:proofErr w:type="spellStart"/>
+      <w:r>
+        <w:t>FastAPI</w:t>
+      </w:r>
+      <w:proofErr w:type="spellEnd"/>
+      <w:r>
+        <w:t xml:space="preserve">, Spring Boot, Django REST Framework, </w:t>
+      </w:r>
+      <w:proofErr w:type="spellStart"/>
+      <w:r>
+        <w:t>NestJS</w:t>
+      </w:r>
+      <w:proofErr w:type="spellEnd"/>
+      <w:r>
+        <w:t>, PostgreSQL, and MongoDB. Demonstrated ability to own features end-to-end — from schema design and API implementation to deployment and monitoring. Adept at converting repetitive operational processes into reliable, configuration-driven systems with full audit trails.</w:t>
       </w:r>
     </w:p>
     <w:p>
@@ -213,12 +303,37 @@
             </w:tcMar>
           </w:tcPr>
           <w:p>
+            <w:proofErr w:type="spellStart"/>
             <w:r>
               <w:rPr>
                 <w:sz w:val="19"/>
                 <w:szCs w:val="19"/>
               </w:rPr>
-              <w:t>FastAPI, Spring Boot, Flask, Django REST Framework, NestJS, Next.js, React</w:t>
+              <w:t>FastAPI</w:t>
+            </w:r>
+            <w:proofErr w:type="spellEnd"/>
+            <w:r>
+              <w:rPr>
+                <w:sz w:val="19"/>
+                <w:szCs w:val="19"/>
+              </w:rPr>
+              <w:t xml:space="preserve">, Spring Boot, Flask, Django REST Framework, </w:t>
+            </w:r>
+            <w:proofErr w:type="spellStart"/>
+            <w:r>
+              <w:rPr>
+                <w:sz w:val="19"/>
+                <w:szCs w:val="19"/>
+              </w:rPr>
+              <w:t>NestJS</w:t>
+            </w:r>
+            <w:proofErr w:type="spellEnd"/>
+            <w:r>
+              <w:rPr>
+                <w:sz w:val="19"/>
+                <w:szCs w:val="19"/>
+              </w:rPr>
+              <w:t>, Next.js, React</w:t>
             </w:r>
           </w:p>
         </w:tc>
@@ -263,7 +378,39 @@
                 <w:sz w:val="19"/>
                 <w:szCs w:val="19"/>
               </w:rPr>
-              <w:t>Playwright, PyAutoGUI, Selenium, TagUI, Scrapy, n8n</w:t>
+              <w:t xml:space="preserve">Playwright, </w:t>
+            </w:r>
+            <w:proofErr w:type="spellStart"/>
+            <w:r>
+              <w:rPr>
+                <w:sz w:val="19"/>
+                <w:szCs w:val="19"/>
+              </w:rPr>
+              <w:t>PyAutoGUI</w:t>
+            </w:r>
+            <w:proofErr w:type="spellEnd"/>
+            <w:r>
+              <w:rPr>
+                <w:sz w:val="19"/>
+                <w:szCs w:val="19"/>
+              </w:rPr>
+              <w:t xml:space="preserve">, Selenium, </w:t>
+            </w:r>
+            <w:proofErr w:type="spellStart"/>
+            <w:r>
+              <w:rPr>
+                <w:sz w:val="19"/>
+                <w:szCs w:val="19"/>
+              </w:rPr>
+              <w:t>TagUI</w:t>
+            </w:r>
+            <w:proofErr w:type="spellEnd"/>
+            <w:r>
+              <w:rPr>
+                <w:sz w:val="19"/>
+                <w:szCs w:val="19"/>
+              </w:rPr>
+              <w:t>, Scrapy, n8n</w:t>
             </w:r>
           </w:p>
         </w:tc>
@@ -308,7 +455,23 @@
                 <w:sz w:val="19"/>
                 <w:szCs w:val="19"/>
               </w:rPr>
-              <w:t>PostgreSQL, MongoDB, Mongoose, SQLAlchemy, psycopg2</w:t>
+              <w:t xml:space="preserve">PostgreSQL, MongoDB, Mongoose, </w:t>
+            </w:r>
+            <w:proofErr w:type="spellStart"/>
+            <w:r>
+              <w:rPr>
+                <w:sz w:val="19"/>
+                <w:szCs w:val="19"/>
+              </w:rPr>
+              <w:t>SQLAlchemy</w:t>
+            </w:r>
+            <w:proofErr w:type="spellEnd"/>
+            <w:r>
+              <w:rPr>
+                <w:sz w:val="19"/>
+                <w:szCs w:val="19"/>
+              </w:rPr>
+              <w:t>, psycopg2</w:t>
             </w:r>
           </w:p>
         </w:tc>
@@ -443,7 +606,23 @@
                 <w:sz w:val="19"/>
                 <w:szCs w:val="19"/>
               </w:rPr>
-              <w:t>JWT, Passport, bcrypt, AES, RSA, ABAC, OTP, MFA, TOTP</w:t>
+              <w:t xml:space="preserve">JWT, Passport, </w:t>
+            </w:r>
+            <w:proofErr w:type="spellStart"/>
+            <w:r>
+              <w:rPr>
+                <w:sz w:val="19"/>
+                <w:szCs w:val="19"/>
+              </w:rPr>
+              <w:t>bcrypt</w:t>
+            </w:r>
+            <w:proofErr w:type="spellEnd"/>
+            <w:r>
+              <w:rPr>
+                <w:sz w:val="19"/>
+                <w:szCs w:val="19"/>
+              </w:rPr>
+              <w:t>, AES, RSA, ABAC, OTP, MFA, TOTP</w:t>
             </w:r>
           </w:p>
         </w:tc>
@@ -488,7 +667,71 @@
                 <w:sz w:val="19"/>
                 <w:szCs w:val="19"/>
               </w:rPr>
-              <w:t>TensorFlow, Keras, Librosa, scikit-learn, LangChain, OpenAI API, Gemini API</w:t>
+              <w:t xml:space="preserve">TensorFlow, </w:t>
+            </w:r>
+            <w:proofErr w:type="spellStart"/>
+            <w:r>
+              <w:rPr>
+                <w:sz w:val="19"/>
+                <w:szCs w:val="19"/>
+              </w:rPr>
+              <w:t>Keras</w:t>
+            </w:r>
+            <w:proofErr w:type="spellEnd"/>
+            <w:r>
+              <w:rPr>
+                <w:sz w:val="19"/>
+                <w:szCs w:val="19"/>
+              </w:rPr>
+              <w:t xml:space="preserve">, </w:t>
+            </w:r>
+            <w:proofErr w:type="spellStart"/>
+            <w:r>
+              <w:rPr>
+                <w:sz w:val="19"/>
+                <w:szCs w:val="19"/>
+              </w:rPr>
+              <w:t>Librosa</w:t>
+            </w:r>
+            <w:proofErr w:type="spellEnd"/>
+            <w:r>
+              <w:rPr>
+                <w:sz w:val="19"/>
+                <w:szCs w:val="19"/>
+              </w:rPr>
+              <w:t xml:space="preserve">, scikit-learn, </w:t>
+            </w:r>
+            <w:proofErr w:type="spellStart"/>
+            <w:r>
+              <w:rPr>
+                <w:sz w:val="19"/>
+                <w:szCs w:val="19"/>
+              </w:rPr>
+              <w:t>LangChain</w:t>
+            </w:r>
+            <w:proofErr w:type="spellEnd"/>
+            <w:r>
+              <w:rPr>
+                <w:sz w:val="19"/>
+                <w:szCs w:val="19"/>
+              </w:rPr>
+              <w:t xml:space="preserve">, </w:t>
+            </w:r>
+            <w:proofErr w:type="spellStart"/>
+            <w:r>
+              <w:rPr>
+                <w:sz w:val="19"/>
+                <w:szCs w:val="19"/>
+              </w:rPr>
+              <w:t>OpenAI</w:t>
+            </w:r>
+            <w:proofErr w:type="spellEnd"/>
+            <w:r>
+              <w:rPr>
+                <w:sz w:val="19"/>
+                <w:szCs w:val="19"/>
+              </w:rPr>
+              <w:t xml:space="preserve"> API, Gemini API</w:t>
             </w:r>
           </w:p>
         </w:tc>
@@ -622,6 +865,7 @@
         </w:rPr>
         <w:t xml:space="preserve"> </w:t>
       </w:r>
+      <w:proofErr w:type="spellStart"/>
       <w:r>
         <w:rPr>
           <w:i/>
@@ -630,7 +874,18 @@
           <w:sz w:val="21"/>
           <w:szCs w:val="21"/>
         </w:rPr>
-        <w:t>Clarivium Technologies</w:t>
+        <w:t>Clarivium</w:t>
+      </w:r>
+      <w:proofErr w:type="spellEnd"/>
+      <w:r>
+        <w:rPr>
+          <w:i/>
+          <w:iCs/>
+          <w:color w:val="2E75B6"/>
+          <w:sz w:val="21"/>
+          <w:szCs w:val="21"/>
+        </w:rPr>
+        <w:t xml:space="preserve"> Technologies</w:t>
       </w:r>
     </w:p>
     <w:p>
@@ -707,6 +962,7 @@
       <w:r>
         <w:t xml:space="preserve"> and </w:t>
       </w:r>
+      <w:proofErr w:type="spellStart"/>
       <w:r>
         <w:rPr>
           <w:b/>
@@ -714,8 +970,17 @@
         </w:rPr>
         <w:t>PyAutoGUI</w:t>
       </w:r>
-      <w:r>
-        <w:t xml:space="preserve"> covering login, OTP/TOTP prompts, date filtering, report export, retry logic, and cleanup — automating </w:t>
+      <w:proofErr w:type="spellEnd"/>
+      <w:r>
+        <w:t xml:space="preserve"> covering login, OTP/TOTP prompts, date filtering, report export, retry logic, and </w:t>
+      </w:r>
+      <w:proofErr w:type="spellStart"/>
+      <w:r>
+        <w:t>cleanup</w:t>
+      </w:r>
+      <w:proofErr w:type="spellEnd"/>
+      <w:r>
+        <w:t xml:space="preserve"> — automating </w:t>
       </w:r>
       <w:r>
         <w:rPr>
@@ -758,7 +1023,15 @@
         <w:t>~90%</w:t>
       </w:r>
       <w:r>
-        <w:t xml:space="preserve"> and enabling full replayability of failed stages.</w:t>
+        <w:t xml:space="preserve"> and enabling full </w:t>
+      </w:r>
+      <w:proofErr w:type="spellStart"/>
+      <w:r>
+        <w:t>replayability</w:t>
+      </w:r>
+      <w:proofErr w:type="spellEnd"/>
+      <w:r>
+        <w:t xml:space="preserve"> of failed stages.</w:t>
       </w:r>
     </w:p>
     <w:p>
@@ -783,6 +1056,7 @@
       <w:r>
         <w:t xml:space="preserve">- and </w:t>
       </w:r>
+      <w:proofErr w:type="spellStart"/>
       <w:r>
         <w:rPr>
           <w:b/>
@@ -790,6 +1064,7 @@
         </w:rPr>
         <w:t>SQLAlchemy</w:t>
       </w:r>
+      <w:proofErr w:type="spellEnd"/>
       <w:r>
         <w:t xml:space="preserve">-based ingestion handlers for </w:t>
       </w:r>
@@ -877,7 +1152,15 @@
         <w:t>n8n</w:t>
       </w:r>
       <w:r>
-        <w:t xml:space="preserve"> workflows (21 branchwise KPI refresh + 25 dashboard freshness monitoring) integrating </w:t>
+        <w:t xml:space="preserve"> workflows (21 </w:t>
+      </w:r>
+      <w:proofErr w:type="spellStart"/>
+      <w:r>
+        <w:t>branchwise</w:t>
+      </w:r>
+      <w:proofErr w:type="spellEnd"/>
+      <w:r>
+        <w:t xml:space="preserve"> KPI refresh + 25 dashboard freshness monitoring) integrating </w:t>
       </w:r>
       <w:r>
         <w:rPr>
@@ -887,7 +1170,15 @@
         <w:t>Power BI</w:t>
       </w:r>
       <w:r>
-        <w:t xml:space="preserve"> executeQueries API, </w:t>
+        <w:t xml:space="preserve"> </w:t>
+      </w:r>
+      <w:proofErr w:type="spellStart"/>
+      <w:r>
+        <w:t>executeQueries</w:t>
+      </w:r>
+      <w:proofErr w:type="spellEnd"/>
+      <w:r>
+        <w:t xml:space="preserve"> API, </w:t>
       </w:r>
       <w:r>
         <w:rPr>
@@ -897,7 +1188,15 @@
         <w:t>PostgreSQL</w:t>
       </w:r>
       <w:r>
-        <w:t xml:space="preserve"> upserts, and notification steps — replacing manual analytics validation for a 10-branch automotive client.</w:t>
+        <w:t xml:space="preserve"> </w:t>
+      </w:r>
+      <w:proofErr w:type="spellStart"/>
+      <w:r>
+        <w:t>upserts</w:t>
+      </w:r>
+      <w:proofErr w:type="spellEnd"/>
+      <w:r>
+        <w:t>, and notification steps — replacing manual analytics validation for a 10-branch automotive client.</w:t>
       </w:r>
     </w:p>
     <w:p>
@@ -971,13 +1270,23 @@
         </w:rPr>
         <w:t xml:space="preserve"> via </w:t>
       </w:r>
+      <w:proofErr w:type="spellStart"/>
       <w:r>
         <w:rPr>
           <w:rFonts w:asciiTheme="minorHAnsi" w:eastAsia="Times New Roman" w:hAnsiTheme="minorHAnsi" w:cstheme="minorHAnsi"/>
           <w:b/>
           <w:bCs/>
         </w:rPr>
-        <w:t>AiSensy BSP APIs</w:t>
+        <w:t>AiSensy</w:t>
+      </w:r>
+      <w:proofErr w:type="spellEnd"/>
+      <w:r>
+        <w:rPr>
+          <w:rFonts w:asciiTheme="minorHAnsi" w:eastAsia="Times New Roman" w:hAnsiTheme="minorHAnsi" w:cstheme="minorHAnsi"/>
+          <w:b/>
+          <w:bCs/>
+        </w:rPr>
+        <w:t xml:space="preserve"> BSP APIs</w:t>
       </w:r>
       <w:r>
         <w:rPr>
@@ -1130,6 +1439,7 @@
         <w:rPr>
           <w:rFonts w:asciiTheme="minorHAnsi" w:eastAsia="Times New Roman" w:hAnsiTheme="minorHAnsi" w:cstheme="minorHAnsi"/>
         </w:rPr>
+        <w:lastRenderedPageBreak/>
         <w:t xml:space="preserve">Engineered the migration from manual campaign operations to a </w:t>
       </w:r>
       <w:r>
@@ -1197,7 +1507,6 @@
           <w:sz w:val="21"/>
           <w:szCs w:val="21"/>
         </w:rPr>
-        <w:lastRenderedPageBreak/>
         <w:t xml:space="preserve">Backend Developer </w:t>
       </w:r>
       <w:r>
@@ -1226,6 +1535,7 @@
         </w:rPr>
         <w:t xml:space="preserve"> </w:t>
       </w:r>
+      <w:proofErr w:type="spellStart"/>
       <w:r>
         <w:rPr>
           <w:i/>
@@ -1236,6 +1546,7 @@
         </w:rPr>
         <w:t>CleandeskAI</w:t>
       </w:r>
+      <w:proofErr w:type="spellEnd"/>
       <w:r>
         <w:rPr>
           <w:i/>
@@ -1424,6 +1735,7 @@
         </w:rPr>
         <w:t xml:space="preserve"> </w:t>
       </w:r>
+      <w:proofErr w:type="spellStart"/>
       <w:r>
         <w:rPr>
           <w:i/>
@@ -1432,7 +1744,18 @@
           <w:sz w:val="21"/>
           <w:szCs w:val="21"/>
         </w:rPr>
-        <w:t>Simbiotik Technologies</w:t>
+        <w:t>Simbiotik</w:t>
+      </w:r>
+      <w:proofErr w:type="spellEnd"/>
+      <w:r>
+        <w:rPr>
+          <w:i/>
+          <w:iCs/>
+          <w:color w:val="2E75B6"/>
+          <w:sz w:val="21"/>
+          <w:szCs w:val="21"/>
+        </w:rPr>
+        <w:t xml:space="preserve"> Technologies</w:t>
       </w:r>
       <w:r>
         <w:rPr>
@@ -1484,6 +1807,7 @@
       <w:r>
         <w:t xml:space="preserve">Built backend modules for an HRMS platform using </w:t>
       </w:r>
+      <w:proofErr w:type="spellStart"/>
       <w:r>
         <w:rPr>
           <w:b/>
@@ -1491,6 +1815,7 @@
         </w:rPr>
         <w:t>NestJS</w:t>
       </w:r>
+      <w:proofErr w:type="spellEnd"/>
       <w:r>
         <w:t xml:space="preserve">, </w:t>
       </w:r>
@@ -1547,6 +1872,7 @@
       <w:r>
         <w:t xml:space="preserve">-based authentication with </w:t>
       </w:r>
+      <w:proofErr w:type="spellStart"/>
       <w:r>
         <w:rPr>
           <w:b/>
@@ -1554,6 +1880,7 @@
         </w:rPr>
         <w:t>bcrypt</w:t>
       </w:r>
+      <w:proofErr w:type="spellEnd"/>
       <w:r>
         <w:t xml:space="preserve"> password hashing, OTP-based MFA, and </w:t>
       </w:r>
@@ -1659,6 +1986,7 @@
         </w:rPr>
         <w:t xml:space="preserve"> </w:t>
       </w:r>
+      <w:proofErr w:type="spellStart"/>
       <w:r>
         <w:rPr>
           <w:i/>
@@ -1667,7 +1995,18 @@
           <w:sz w:val="21"/>
           <w:szCs w:val="21"/>
         </w:rPr>
-        <w:t>Zidio Development</w:t>
+        <w:t>Zidio</w:t>
+      </w:r>
+      <w:proofErr w:type="spellEnd"/>
+      <w:r>
+        <w:rPr>
+          <w:i/>
+          <w:iCs/>
+          <w:color w:val="2E75B6"/>
+          <w:sz w:val="21"/>
+          <w:szCs w:val="21"/>
+        </w:rPr>
+        <w:t xml:space="preserve"> Development</w:t>
       </w:r>
       <w:r>
         <w:rPr>
@@ -1732,8 +2071,17 @@
           <w:b/>
           <w:bCs/>
         </w:rPr>
-        <w:t>TensorFlow/Keras</w:t>
-      </w:r>
+        <w:t>TensorFlow/</w:t>
+      </w:r>
+      <w:proofErr w:type="spellStart"/>
+      <w:r>
+        <w:rPr>
+          <w:b/>
+          <w:bCs/>
+        </w:rPr>
+        <w:t>Keras</w:t>
+      </w:r>
+      <w:proofErr w:type="spellEnd"/>
       <w:r>
         <w:t xml:space="preserve"> — implementing </w:t>
       </w:r>
@@ -1747,6 +2095,7 @@
       <w:r>
         <w:t xml:space="preserve"> feature extraction with </w:t>
       </w:r>
+      <w:proofErr w:type="spellStart"/>
       <w:r>
         <w:rPr>
           <w:b/>
@@ -1754,6 +2103,7 @@
         </w:rPr>
         <w:t>Librosa</w:t>
       </w:r>
+      <w:proofErr w:type="spellEnd"/>
       <w:r>
         <w:t xml:space="preserve"> and an </w:t>
       </w:r>
@@ -1952,7 +2302,15 @@
         <w:t>Isolation Forest</w:t>
       </w:r>
       <w:r>
-        <w:t xml:space="preserve"> model and rule-based scoring to flag suspicious access behavior and trigger real-time administrator email alerts.</w:t>
+        <w:t xml:space="preserve"> model and rule-based scoring to flag suspicious access </w:t>
+      </w:r>
+      <w:proofErr w:type="spellStart"/>
+      <w:r>
+        <w:t>behavior</w:t>
+      </w:r>
+      <w:proofErr w:type="spellEnd"/>
+      <w:r>
+        <w:t xml:space="preserve"> and trigger real-time administrator email alerts.</w:t>
       </w:r>
     </w:p>
     <w:p>
@@ -1982,6 +2340,7 @@
       <w:pPr>
         <w:spacing w:before="140" w:after="20"/>
       </w:pPr>
+      <w:proofErr w:type="spellStart"/>
       <w:r>
         <w:rPr>
           <w:b/>
@@ -1990,7 +2349,18 @@
           <w:sz w:val="21"/>
           <w:szCs w:val="21"/>
         </w:rPr>
-        <w:t>CityPulse — Event Recommendation Chatbot</w:t>
+        <w:t>CityPulse</w:t>
+      </w:r>
+      <w:proofErr w:type="spellEnd"/>
+      <w:r>
+        <w:rPr>
+          <w:b/>
+          <w:bCs/>
+          <w:color w:val="000000"/>
+          <w:sz w:val="21"/>
+          <w:szCs w:val="21"/>
+        </w:rPr>
+        <w:t xml:space="preserve"> — Event Recommendation Chatbot</w:t>
       </w:r>
     </w:p>
     <w:p>
@@ -2009,6 +2379,7 @@
         </w:rPr>
         <w:t xml:space="preserve">Tech Stack: </w:t>
       </w:r>
+      <w:proofErr w:type="spellStart"/>
       <w:r>
         <w:rPr>
           <w:i/>
@@ -2017,7 +2388,62 @@
           <w:sz w:val="19"/>
           <w:szCs w:val="19"/>
         </w:rPr>
-        <w:t>FastAPI, Next.js, React, MongoDB, LangChain, OpenAI GPT, Scrapy, Selenium</w:t>
+        <w:t>FastAPI</w:t>
+      </w:r>
+      <w:proofErr w:type="spellEnd"/>
+      <w:r>
+        <w:rPr>
+          <w:i/>
+          <w:iCs/>
+          <w:color w:val="555555"/>
+          <w:sz w:val="19"/>
+          <w:szCs w:val="19"/>
+        </w:rPr>
+        <w:t xml:space="preserve">, Next.js, React, MongoDB, </w:t>
+      </w:r>
+      <w:proofErr w:type="spellStart"/>
+      <w:r>
+        <w:rPr>
+          <w:i/>
+          <w:iCs/>
+          <w:color w:val="555555"/>
+          <w:sz w:val="19"/>
+          <w:szCs w:val="19"/>
+        </w:rPr>
+        <w:t>LangChain</w:t>
+      </w:r>
+      <w:proofErr w:type="spellEnd"/>
+      <w:r>
+        <w:rPr>
+          <w:i/>
+          <w:iCs/>
+          <w:color w:val="555555"/>
+          <w:sz w:val="19"/>
+          <w:szCs w:val="19"/>
+        </w:rPr>
+        <w:t xml:space="preserve">, </w:t>
+      </w:r>
+      <w:proofErr w:type="spellStart"/>
+      <w:r>
+        <w:rPr>
+          <w:i/>
+          <w:iCs/>
+          <w:color w:val="555555"/>
+          <w:sz w:val="19"/>
+          <w:szCs w:val="19"/>
+        </w:rPr>
+        <w:t>OpenAI</w:t>
+      </w:r>
+      <w:proofErr w:type="spellEnd"/>
+      <w:r>
+        <w:rPr>
+          <w:i/>
+          <w:iCs/>
+          <w:color w:val="555555"/>
+          <w:sz w:val="19"/>
+          <w:szCs w:val="19"/>
+        </w:rPr>
+        <w:t xml:space="preserve"> GPT, Scrapy, Selenium</w:t>
       </w:r>
     </w:p>
     <w:p>
@@ -2032,6 +2458,7 @@
       <w:r>
         <w:t xml:space="preserve">Built a </w:t>
       </w:r>
+      <w:proofErr w:type="spellStart"/>
       <w:r>
         <w:rPr>
           <w:b/>
@@ -2039,6 +2466,7 @@
         </w:rPr>
         <w:t>FastAPI</w:t>
       </w:r>
+      <w:proofErr w:type="spellEnd"/>
       <w:r>
         <w:t xml:space="preserve"> backend and </w:t>
       </w:r>
@@ -2052,6 +2480,7 @@
       <w:r>
         <w:t xml:space="preserve"> frontend for an event recommendation chatbot with Google OAuth sign-in, MongoDB session persistence, and </w:t>
       </w:r>
+      <w:proofErr w:type="spellStart"/>
       <w:r>
         <w:rPr>
           <w:b/>
@@ -2059,6 +2488,7 @@
         </w:rPr>
         <w:t>LangChain</w:t>
       </w:r>
+      <w:proofErr w:type="spellEnd"/>
       <w:r>
         <w:t xml:space="preserve">-powered conversational flows delivering recommendations in </w:t>
       </w:r>
@@ -2085,12 +2515,21 @@
       <w:r>
         <w:t xml:space="preserve">Engineered a </w:t>
       </w:r>
-      <w:r>
-        <w:rPr>
-          <w:b/>
-          <w:bCs/>
-        </w:rPr>
-        <w:t>LangChain RAG</w:t>
+      <w:proofErr w:type="spellStart"/>
+      <w:r>
+        <w:rPr>
+          <w:b/>
+          <w:bCs/>
+        </w:rPr>
+        <w:t>LangChain</w:t>
+      </w:r>
+      <w:proofErr w:type="spellEnd"/>
+      <w:r>
+        <w:rPr>
+          <w:b/>
+          <w:bCs/>
+        </w:rPr>
+        <w:t xml:space="preserve"> RAG</w:t>
       </w:r>
       <w:r>
         <w:t xml:space="preserve"> pipeline with conversation memory, keyword and timeframe entity extraction, and preference tracking over a </w:t>
@@ -2159,6 +2598,7 @@
         <w:spacing w:before="30" w:after="30"/>
       </w:pPr>
       <w:r>
+        <w:lastRenderedPageBreak/>
         <w:t>Added engagement tracking endpoints for likes and event clicks to power popularity-based ranking in recommendation retrieval.</w:t>
       </w:r>
     </w:p>
@@ -2189,7 +2629,6 @@
           <w:sz w:val="22"/>
           <w:szCs w:val="22"/>
         </w:rPr>
-        <w:lastRenderedPageBreak/>
         <w:t>CERTIFICATIONS</w:t>
       </w:r>
     </w:p>
@@ -2448,7 +2887,27 @@
           <w:sz w:val="24"/>
           <w:szCs w:val="24"/>
         </w:rPr>
-        <w:t>NLP for ML with Python: Advanced NLP Using spaCy &amp; Scikit-learn</w:t>
+        <w:t xml:space="preserve">NLP for ML with Python: Advanced NLP Using </w:t>
+      </w:r>
+      <w:proofErr w:type="spellStart"/>
+      <w:r>
+        <w:rPr>
+          <w:b/>
+          <w:bCs/>
+          <w:sz w:val="24"/>
+          <w:szCs w:val="24"/>
+        </w:rPr>
+        <w:t>spaCy</w:t>
+      </w:r>
+      <w:proofErr w:type="spellEnd"/>
+      <w:r>
+        <w:rPr>
+          <w:b/>
+          <w:bCs/>
+          <w:sz w:val="24"/>
+          <w:szCs w:val="24"/>
+        </w:rPr>
+        <w:t xml:space="preserve"> &amp; Scikit-learn</w:t>
       </w:r>
       <w:r>
         <w:rPr>
@@ -2631,15 +3090,27 @@
         </w:rPr>
         <w:t xml:space="preserve">                       </w:t>
       </w:r>
-      <w:r>
-        <w:rPr>
-          <w:i/>
-          <w:iCs/>
-          <w:color w:val="444444"/>
-          <w:sz w:val="24"/>
-          <w:szCs w:val="24"/>
-        </w:rPr>
-        <w:t>Simbiotik Technologies</w:t>
+      <w:proofErr w:type="spellStart"/>
+      <w:r>
+        <w:rPr>
+          <w:i/>
+          <w:iCs/>
+          <w:color w:val="444444"/>
+          <w:sz w:val="24"/>
+          <w:szCs w:val="24"/>
+        </w:rPr>
+        <w:t>Simbiotik</w:t>
+      </w:r>
+      <w:proofErr w:type="spellEnd"/>
+      <w:r>
+        <w:rPr>
+          <w:i/>
+          <w:iCs/>
+          <w:color w:val="444444"/>
+          <w:sz w:val="24"/>
+          <w:szCs w:val="24"/>
+        </w:rPr>
+        <w:t xml:space="preserve"> Technologies</w:t>
       </w:r>
       <w:r>
         <w:rPr>
@@ -3031,6 +3502,7 @@
         </w:rPr>
         <w:t xml:space="preserve">                                      </w:t>
       </w:r>
+      <w:proofErr w:type="spellStart"/>
       <w:r>
         <w:rPr>
           <w:i/>
@@ -3041,6 +3513,7 @@
         </w:rPr>
         <w:t>HackerRank</w:t>
       </w:r>
+      <w:proofErr w:type="spellEnd"/>
       <w:r>
         <w:rPr>
           <w:i/>
@@ -3265,14 +3738,25 @@
         </w:tabs>
         <w:spacing w:before="80" w:after="20"/>
       </w:pPr>
-      <w:r>
-        <w:rPr>
-          <w:b/>
-          <w:bCs/>
-          <w:sz w:val="21"/>
-          <w:szCs w:val="21"/>
-        </w:rPr>
-        <w:t>B.Tech — Computer Science and Engineering</w:t>
+      <w:proofErr w:type="spellStart"/>
+      <w:r>
+        <w:rPr>
+          <w:b/>
+          <w:bCs/>
+          <w:sz w:val="21"/>
+          <w:szCs w:val="21"/>
+        </w:rPr>
+        <w:t>B.Tech</w:t>
+      </w:r>
+      <w:proofErr w:type="spellEnd"/>
+      <w:r>
+        <w:rPr>
+          <w:b/>
+          <w:bCs/>
+          <w:sz w:val="21"/>
+          <w:szCs w:val="21"/>
+        </w:rPr>
+        <w:t xml:space="preserve"> — Computer Science and Engineering</w:t>
       </w:r>
       <w:r>
         <w:rPr>
@@ -3318,14 +3802,25 @@
           <w:szCs w:val="21"/>
         </w:rPr>
       </w:pPr>
-      <w:r>
-        <w:rPr>
-          <w:b/>
-          <w:bCs/>
-          <w:sz w:val="21"/>
-          <w:szCs w:val="21"/>
-        </w:rPr>
-        <w:t>Lalaji Memorial Omega International School</w:t>
+      <w:proofErr w:type="spellStart"/>
+      <w:r>
+        <w:rPr>
+          <w:b/>
+          <w:bCs/>
+          <w:sz w:val="21"/>
+          <w:szCs w:val="21"/>
+        </w:rPr>
+        <w:t>Lalaji</w:t>
+      </w:r>
+      <w:proofErr w:type="spellEnd"/>
+      <w:r>
+        <w:rPr>
+          <w:b/>
+          <w:bCs/>
+          <w:sz w:val="21"/>
+          <w:szCs w:val="21"/>
+        </w:rPr>
+        <w:t xml:space="preserve"> Memorial Omega International School</w:t>
       </w:r>
       <w:r>
         <w:rPr>
@@ -4340,6 +4835,18 @@
       <w:bCs/>
     </w:rPr>
   </w:style>
+  <w:style w:type="character" w:styleId="FollowedHyperlink">
+    <w:name w:val="FollowedHyperlink"/>
+    <w:basedOn w:val="DefaultParagraphFont"/>
+    <w:uiPriority w:val="99"/>
+    <w:semiHidden/>
+    <w:unhideWhenUsed/>
+    <w:rsid w:val="00550504"/>
+    <w:rPr>
+      <w:color w:val="954F72" w:themeColor="followedHyperlink"/>
+      <w:u w:val="single"/>
+    </w:rPr>
+  </w:style>
 </w:styles>
 </file>
 

</xml_diff>

<commit_message>
update resume and add credentials
</commit_message>
<xml_diff>
--- a/AKILAN-RESUME.docx
+++ b/AKILAN-RESUME.docx
@@ -6,8 +6,6 @@
       <w:pPr>
         <w:spacing w:after="60"/>
         <w:jc w:val="center"/>
-      </w:pPr>
-      <w:r>
         <w:rPr>
           <w:b/>
           <w:bCs/>
@@ -15,7 +13,36 @@
           <w:sz w:val="38"/>
           <w:szCs w:val="38"/>
         </w:rPr>
+      </w:pPr>
+      <w:r>
+        <w:rPr>
+          <w:b/>
+          <w:bCs/>
+          <w:color w:val="1F4E79"/>
+          <w:sz w:val="38"/>
+          <w:szCs w:val="38"/>
+        </w:rPr>
         <w:t>AKILAN MANIKANDAN</w:t>
+      </w:r>
+    </w:p>
+    <w:p>
+      <w:pPr>
+        <w:spacing w:after="60"/>
+        <w:jc w:val="center"/>
+        <w:rPr>
+          <w:sz w:val="28"/>
+          <w:szCs w:val="28"/>
+        </w:rPr>
+      </w:pPr>
+      <w:r>
+        <w:rPr>
+          <w:b/>
+          <w:bCs/>
+          <w:color w:val="1F4E79"/>
+          <w:sz w:val="28"/>
+          <w:szCs w:val="28"/>
+        </w:rPr>
+        <w:t>Backend &amp; Automation Engineer | Python | FastAPI | RPA | Applied AI Systems</w:t>
       </w:r>
     </w:p>
     <w:p>
@@ -46,26 +73,8 @@
             <w:sz w:val="18"/>
             <w:szCs w:val="18"/>
           </w:rPr>
-          <w:t>linkedin.com/in</w:t>
+          <w:t>linkedin.com/in/akilanmanikandan</w:t>
         </w:r>
-        <w:r>
-          <w:rPr>
-            <w:rStyle w:val="Hyperlink"/>
-            <w:sz w:val="18"/>
-            <w:szCs w:val="18"/>
-          </w:rPr>
-          <w:t>/</w:t>
-        </w:r>
-        <w:proofErr w:type="spellStart"/>
-        <w:r>
-          <w:rPr>
-            <w:rStyle w:val="Hyperlink"/>
-            <w:sz w:val="18"/>
-            <w:szCs w:val="18"/>
-          </w:rPr>
-          <w:t>akilanmanikandan</w:t>
-        </w:r>
-        <w:proofErr w:type="spellEnd"/>
       </w:hyperlink>
       <w:r>
         <w:rPr>
@@ -90,26 +99,8 @@
             <w:sz w:val="18"/>
             <w:szCs w:val="18"/>
           </w:rPr>
-          <w:t>github.com</w:t>
+          <w:t>github.com/akilanmanikandan</w:t>
         </w:r>
-        <w:r>
-          <w:rPr>
-            <w:rStyle w:val="Hyperlink"/>
-            <w:sz w:val="18"/>
-            <w:szCs w:val="18"/>
-          </w:rPr>
-          <w:t>/</w:t>
-        </w:r>
-        <w:proofErr w:type="spellStart"/>
-        <w:r>
-          <w:rPr>
-            <w:rStyle w:val="Hyperlink"/>
-            <w:sz w:val="18"/>
-            <w:szCs w:val="18"/>
-          </w:rPr>
-          <w:t>akilanmanikandan</w:t>
-        </w:r>
-        <w:proofErr w:type="spellEnd"/>
         <w:r>
           <w:rPr>
             <w:rStyle w:val="Hyperlink"/>
@@ -169,23 +160,13 @@
         <w:spacing w:before="60" w:after="60"/>
       </w:pPr>
       <w:r>
-        <w:t xml:space="preserve">Backend and automation engineer with 1+ year of internship experience building production-grade API services, workflow automation pipelines, and data ingestion systems. Proficient in Python, Java, TypeScript, and SQL, with hands-on delivery across </w:t>
-      </w:r>
-      <w:proofErr w:type="spellStart"/>
-      <w:r>
-        <w:t>FastAPI</w:t>
-      </w:r>
-      <w:proofErr w:type="spellEnd"/>
-      <w:r>
-        <w:t xml:space="preserve">, Spring Boot, Django REST Framework, </w:t>
-      </w:r>
-      <w:proofErr w:type="spellStart"/>
-      <w:r>
-        <w:t>NestJS</w:t>
-      </w:r>
-      <w:proofErr w:type="spellEnd"/>
-      <w:r>
-        <w:t>, PostgreSQL, and MongoDB. Demonstrated ability to own features end-to-end — from schema design and API implementation to deployment and monitoring. Adept at converting repetitive operational processes into reliable, configuration-driven systems with full audit trails.</w:t>
+        <w:t xml:space="preserve">Backend and automation engineer with </w:t>
+      </w:r>
+      <w:r>
+        <w:t>0-1</w:t>
+      </w:r>
+      <w:r>
+        <w:t xml:space="preserve"> year of internship experience building production-grade API services, workflow automation pipelines, and data ingestion systems. Proficient in Python, Java, TypeScript, and SQL, with hands-on delivery across FastAPI, Spring Boot, Django REST Framework, NestJS, PostgreSQL, and MongoDB. Demonstrated ability to own features end-to-end — from schema design and API implementation to deployment and monitoring. Adept at converting repetitive operational processes into reliable, configuration-driven systems with full audit trails.</w:t>
       </w:r>
     </w:p>
     <w:p>
@@ -303,37 +284,12 @@
             </w:tcMar>
           </w:tcPr>
           <w:p>
-            <w:proofErr w:type="spellStart"/>
             <w:r>
               <w:rPr>
                 <w:sz w:val="19"/>
                 <w:szCs w:val="19"/>
               </w:rPr>
-              <w:t>FastAPI</w:t>
-            </w:r>
-            <w:proofErr w:type="spellEnd"/>
-            <w:r>
-              <w:rPr>
-                <w:sz w:val="19"/>
-                <w:szCs w:val="19"/>
-              </w:rPr>
-              <w:t xml:space="preserve">, Spring Boot, Flask, Django REST Framework, </w:t>
-            </w:r>
-            <w:proofErr w:type="spellStart"/>
-            <w:r>
-              <w:rPr>
-                <w:sz w:val="19"/>
-                <w:szCs w:val="19"/>
-              </w:rPr>
-              <w:t>NestJS</w:t>
-            </w:r>
-            <w:proofErr w:type="spellEnd"/>
-            <w:r>
-              <w:rPr>
-                <w:sz w:val="19"/>
-                <w:szCs w:val="19"/>
-              </w:rPr>
-              <w:t>, Next.js, React</w:t>
+              <w:t>FastAPI, Spring Boot, Flask, Django REST Framework, NestJS, Next.js, React</w:t>
             </w:r>
           </w:p>
         </w:tc>
@@ -378,39 +334,7 @@
                 <w:sz w:val="19"/>
                 <w:szCs w:val="19"/>
               </w:rPr>
-              <w:t xml:space="preserve">Playwright, </w:t>
-            </w:r>
-            <w:proofErr w:type="spellStart"/>
-            <w:r>
-              <w:rPr>
-                <w:sz w:val="19"/>
-                <w:szCs w:val="19"/>
-              </w:rPr>
-              <w:t>PyAutoGUI</w:t>
-            </w:r>
-            <w:proofErr w:type="spellEnd"/>
-            <w:r>
-              <w:rPr>
-                <w:sz w:val="19"/>
-                <w:szCs w:val="19"/>
-              </w:rPr>
-              <w:t xml:space="preserve">, Selenium, </w:t>
-            </w:r>
-            <w:proofErr w:type="spellStart"/>
-            <w:r>
-              <w:rPr>
-                <w:sz w:val="19"/>
-                <w:szCs w:val="19"/>
-              </w:rPr>
-              <w:t>TagUI</w:t>
-            </w:r>
-            <w:proofErr w:type="spellEnd"/>
-            <w:r>
-              <w:rPr>
-                <w:sz w:val="19"/>
-                <w:szCs w:val="19"/>
-              </w:rPr>
-              <w:t>, Scrapy, n8n</w:t>
+              <w:t>Playwright, PyAutoGUI, Selenium, TagUI, Scrapy, n8n</w:t>
             </w:r>
           </w:p>
         </w:tc>
@@ -455,23 +379,7 @@
                 <w:sz w:val="19"/>
                 <w:szCs w:val="19"/>
               </w:rPr>
-              <w:t xml:space="preserve">PostgreSQL, MongoDB, Mongoose, </w:t>
-            </w:r>
-            <w:proofErr w:type="spellStart"/>
-            <w:r>
-              <w:rPr>
-                <w:sz w:val="19"/>
-                <w:szCs w:val="19"/>
-              </w:rPr>
-              <w:t>SQLAlchemy</w:t>
-            </w:r>
-            <w:proofErr w:type="spellEnd"/>
-            <w:r>
-              <w:rPr>
-                <w:sz w:val="19"/>
-                <w:szCs w:val="19"/>
-              </w:rPr>
-              <w:t>, psycopg2</w:t>
+              <w:t>PostgreSQL, MongoDB, Mongoose, SQLAlchemy, psycopg2</w:t>
             </w:r>
           </w:p>
         </w:tc>
@@ -606,23 +514,7 @@
                 <w:sz w:val="19"/>
                 <w:szCs w:val="19"/>
               </w:rPr>
-              <w:t xml:space="preserve">JWT, Passport, </w:t>
-            </w:r>
-            <w:proofErr w:type="spellStart"/>
-            <w:r>
-              <w:rPr>
-                <w:sz w:val="19"/>
-                <w:szCs w:val="19"/>
-              </w:rPr>
-              <w:t>bcrypt</w:t>
-            </w:r>
-            <w:proofErr w:type="spellEnd"/>
-            <w:r>
-              <w:rPr>
-                <w:sz w:val="19"/>
-                <w:szCs w:val="19"/>
-              </w:rPr>
-              <w:t>, AES, RSA, ABAC, OTP, MFA, TOTP</w:t>
+              <w:t>JWT, Passport, bcrypt, AES, RSA, ABAC, OTP, MFA, TOTP</w:t>
             </w:r>
           </w:p>
         </w:tc>
@@ -667,71 +559,7 @@
                 <w:sz w:val="19"/>
                 <w:szCs w:val="19"/>
               </w:rPr>
-              <w:t xml:space="preserve">TensorFlow, </w:t>
-            </w:r>
-            <w:proofErr w:type="spellStart"/>
-            <w:r>
-              <w:rPr>
-                <w:sz w:val="19"/>
-                <w:szCs w:val="19"/>
-              </w:rPr>
-              <w:t>Keras</w:t>
-            </w:r>
-            <w:proofErr w:type="spellEnd"/>
-            <w:r>
-              <w:rPr>
-                <w:sz w:val="19"/>
-                <w:szCs w:val="19"/>
-              </w:rPr>
-              <w:t xml:space="preserve">, </w:t>
-            </w:r>
-            <w:proofErr w:type="spellStart"/>
-            <w:r>
-              <w:rPr>
-                <w:sz w:val="19"/>
-                <w:szCs w:val="19"/>
-              </w:rPr>
-              <w:t>Librosa</w:t>
-            </w:r>
-            <w:proofErr w:type="spellEnd"/>
-            <w:r>
-              <w:rPr>
-                <w:sz w:val="19"/>
-                <w:szCs w:val="19"/>
-              </w:rPr>
-              <w:t xml:space="preserve">, scikit-learn, </w:t>
-            </w:r>
-            <w:proofErr w:type="spellStart"/>
-            <w:r>
-              <w:rPr>
-                <w:sz w:val="19"/>
-                <w:szCs w:val="19"/>
-              </w:rPr>
-              <w:t>LangChain</w:t>
-            </w:r>
-            <w:proofErr w:type="spellEnd"/>
-            <w:r>
-              <w:rPr>
-                <w:sz w:val="19"/>
-                <w:szCs w:val="19"/>
-              </w:rPr>
-              <w:t xml:space="preserve">, </w:t>
-            </w:r>
-            <w:proofErr w:type="spellStart"/>
-            <w:r>
-              <w:rPr>
-                <w:sz w:val="19"/>
-                <w:szCs w:val="19"/>
-              </w:rPr>
-              <w:t>OpenAI</w:t>
-            </w:r>
-            <w:proofErr w:type="spellEnd"/>
-            <w:r>
-              <w:rPr>
-                <w:sz w:val="19"/>
-                <w:szCs w:val="19"/>
-              </w:rPr>
-              <w:t xml:space="preserve"> API, Gemini API</w:t>
+              <w:t>TensorFlow, Keras, Librosa, scikit-learn, LangChain, OpenAI API, Gemini API</w:t>
             </w:r>
           </w:p>
         </w:tc>
@@ -776,14 +604,21 @@
                 <w:sz w:val="19"/>
                 <w:szCs w:val="19"/>
               </w:rPr>
-              <w:t>Git, Maven, Tailwind CSS</w:t>
+              <w:t>Git, Maven,</w:t>
             </w:r>
             <w:r>
               <w:rPr>
                 <w:sz w:val="19"/>
                 <w:szCs w:val="19"/>
               </w:rPr>
-              <w:t>, MS Office (Excel, Word, PowerPoint)</w:t>
+              <w:t xml:space="preserve"> </w:t>
+            </w:r>
+            <w:r>
+              <w:rPr>
+                <w:sz w:val="19"/>
+                <w:szCs w:val="19"/>
+              </w:rPr>
+              <w:t>MS Office</w:t>
             </w:r>
           </w:p>
         </w:tc>
@@ -865,7 +700,6 @@
         </w:rPr>
         <w:t xml:space="preserve"> </w:t>
       </w:r>
-      <w:proofErr w:type="spellStart"/>
       <w:r>
         <w:rPr>
           <w:i/>
@@ -874,18 +708,7 @@
           <w:sz w:val="21"/>
           <w:szCs w:val="21"/>
         </w:rPr>
-        <w:t>Clarivium</w:t>
-      </w:r>
-      <w:proofErr w:type="spellEnd"/>
-      <w:r>
-        <w:rPr>
-          <w:i/>
-          <w:iCs/>
-          <w:color w:val="2E75B6"/>
-          <w:sz w:val="21"/>
-          <w:szCs w:val="21"/>
-        </w:rPr>
-        <w:t xml:space="preserve"> Technologies</w:t>
+        <w:t>Clarivium Technologies</w:t>
       </w:r>
     </w:p>
     <w:p>
@@ -962,7 +785,6 @@
       <w:r>
         <w:t xml:space="preserve"> and </w:t>
       </w:r>
-      <w:proofErr w:type="spellStart"/>
       <w:r>
         <w:rPr>
           <w:b/>
@@ -970,17 +792,8 @@
         </w:rPr>
         <w:t>PyAutoGUI</w:t>
       </w:r>
-      <w:proofErr w:type="spellEnd"/>
-      <w:r>
-        <w:t xml:space="preserve"> covering login, OTP/TOTP prompts, date filtering, report export, retry logic, and </w:t>
-      </w:r>
-      <w:proofErr w:type="spellStart"/>
-      <w:r>
-        <w:t>cleanup</w:t>
-      </w:r>
-      <w:proofErr w:type="spellEnd"/>
-      <w:r>
-        <w:t xml:space="preserve"> — automating </w:t>
+      <w:r>
+        <w:t xml:space="preserve"> covering login, OTP/TOTP prompts, date filtering, report export, retry logic, and cleanup — automating </w:t>
       </w:r>
       <w:r>
         <w:rPr>
@@ -1023,15 +836,7 @@
         <w:t>~90%</w:t>
       </w:r>
       <w:r>
-        <w:t xml:space="preserve"> and enabling full </w:t>
-      </w:r>
-      <w:proofErr w:type="spellStart"/>
-      <w:r>
-        <w:t>replayability</w:t>
-      </w:r>
-      <w:proofErr w:type="spellEnd"/>
-      <w:r>
-        <w:t xml:space="preserve"> of failed stages.</w:t>
+        <w:t xml:space="preserve"> and enabling full replayability of failed stages.</w:t>
       </w:r>
     </w:p>
     <w:p>
@@ -1056,7 +861,6 @@
       <w:r>
         <w:t xml:space="preserve">- and </w:t>
       </w:r>
-      <w:proofErr w:type="spellStart"/>
       <w:r>
         <w:rPr>
           <w:b/>
@@ -1064,7 +868,6 @@
         </w:rPr>
         <w:t>SQLAlchemy</w:t>
       </w:r>
-      <w:proofErr w:type="spellEnd"/>
       <w:r>
         <w:t xml:space="preserve">-based ingestion handlers for </w:t>
       </w:r>
@@ -1152,15 +955,7 @@
         <w:t>n8n</w:t>
       </w:r>
       <w:r>
-        <w:t xml:space="preserve"> workflows (21 </w:t>
-      </w:r>
-      <w:proofErr w:type="spellStart"/>
-      <w:r>
-        <w:t>branchwise</w:t>
-      </w:r>
-      <w:proofErr w:type="spellEnd"/>
-      <w:r>
-        <w:t xml:space="preserve"> KPI refresh + 25 dashboard freshness monitoring) integrating </w:t>
+        <w:t xml:space="preserve"> workflows (21 branchwise KPI refresh + 25 dashboard freshness monitoring) integrating </w:t>
       </w:r>
       <w:r>
         <w:rPr>
@@ -1170,15 +965,7 @@
         <w:t>Power BI</w:t>
       </w:r>
       <w:r>
-        <w:t xml:space="preserve"> </w:t>
-      </w:r>
-      <w:proofErr w:type="spellStart"/>
-      <w:r>
-        <w:t>executeQueries</w:t>
-      </w:r>
-      <w:proofErr w:type="spellEnd"/>
-      <w:r>
-        <w:t xml:space="preserve"> API, </w:t>
+        <w:t xml:space="preserve"> executeQueries API, </w:t>
       </w:r>
       <w:r>
         <w:rPr>
@@ -1188,15 +975,7 @@
         <w:t>PostgreSQL</w:t>
       </w:r>
       <w:r>
-        <w:t xml:space="preserve"> </w:t>
-      </w:r>
-      <w:proofErr w:type="spellStart"/>
-      <w:r>
-        <w:t>upserts</w:t>
-      </w:r>
-      <w:proofErr w:type="spellEnd"/>
-      <w:r>
-        <w:t>, and notification steps — replacing manual analytics validation for a 10-branch automotive client.</w:t>
+        <w:t xml:space="preserve"> upserts, and notification steps — replacing manual analytics validation for a 10-branch automotive client.</w:t>
       </w:r>
     </w:p>
     <w:p>
@@ -1270,23 +1049,13 @@
         </w:rPr>
         <w:t xml:space="preserve"> via </w:t>
       </w:r>
-      <w:proofErr w:type="spellStart"/>
       <w:r>
         <w:rPr>
           <w:rFonts w:asciiTheme="minorHAnsi" w:eastAsia="Times New Roman" w:hAnsiTheme="minorHAnsi" w:cstheme="minorHAnsi"/>
           <w:b/>
           <w:bCs/>
         </w:rPr>
-        <w:t>AiSensy</w:t>
-      </w:r>
-      <w:proofErr w:type="spellEnd"/>
-      <w:r>
-        <w:rPr>
-          <w:rFonts w:asciiTheme="minorHAnsi" w:eastAsia="Times New Roman" w:hAnsiTheme="minorHAnsi" w:cstheme="minorHAnsi"/>
-          <w:b/>
-          <w:bCs/>
-        </w:rPr>
-        <w:t xml:space="preserve"> BSP APIs</w:t>
+        <w:t>AiSensy BSP APIs</w:t>
       </w:r>
       <w:r>
         <w:rPr>
@@ -1535,7 +1304,6 @@
         </w:rPr>
         <w:t xml:space="preserve"> </w:t>
       </w:r>
-      <w:proofErr w:type="spellStart"/>
       <w:r>
         <w:rPr>
           <w:i/>
@@ -1546,7 +1314,6 @@
         </w:rPr>
         <w:t>CleandeskAI</w:t>
       </w:r>
-      <w:proofErr w:type="spellEnd"/>
       <w:r>
         <w:rPr>
           <w:i/>
@@ -1735,7 +1502,6 @@
         </w:rPr>
         <w:t xml:space="preserve"> </w:t>
       </w:r>
-      <w:proofErr w:type="spellStart"/>
       <w:r>
         <w:rPr>
           <w:i/>
@@ -1744,18 +1510,7 @@
           <w:sz w:val="21"/>
           <w:szCs w:val="21"/>
         </w:rPr>
-        <w:t>Simbiotik</w:t>
-      </w:r>
-      <w:proofErr w:type="spellEnd"/>
-      <w:r>
-        <w:rPr>
-          <w:i/>
-          <w:iCs/>
-          <w:color w:val="2E75B6"/>
-          <w:sz w:val="21"/>
-          <w:szCs w:val="21"/>
-        </w:rPr>
-        <w:t xml:space="preserve"> Technologies</w:t>
+        <w:t>Simbiotik Technologies</w:t>
       </w:r>
       <w:r>
         <w:rPr>
@@ -1807,7 +1562,6 @@
       <w:r>
         <w:t xml:space="preserve">Built backend modules for an HRMS platform using </w:t>
       </w:r>
-      <w:proofErr w:type="spellStart"/>
       <w:r>
         <w:rPr>
           <w:b/>
@@ -1815,7 +1569,6 @@
         </w:rPr>
         <w:t>NestJS</w:t>
       </w:r>
-      <w:proofErr w:type="spellEnd"/>
       <w:r>
         <w:t xml:space="preserve">, </w:t>
       </w:r>
@@ -1872,7 +1625,6 @@
       <w:r>
         <w:t xml:space="preserve">-based authentication with </w:t>
       </w:r>
-      <w:proofErr w:type="spellStart"/>
       <w:r>
         <w:rPr>
           <w:b/>
@@ -1880,7 +1632,6 @@
         </w:rPr>
         <w:t>bcrypt</w:t>
       </w:r>
-      <w:proofErr w:type="spellEnd"/>
       <w:r>
         <w:t xml:space="preserve"> password hashing, OTP-based MFA, and </w:t>
       </w:r>
@@ -1986,7 +1737,6 @@
         </w:rPr>
         <w:t xml:space="preserve"> </w:t>
       </w:r>
-      <w:proofErr w:type="spellStart"/>
       <w:r>
         <w:rPr>
           <w:i/>
@@ -1995,18 +1745,7 @@
           <w:sz w:val="21"/>
           <w:szCs w:val="21"/>
         </w:rPr>
-        <w:t>Zidio</w:t>
-      </w:r>
-      <w:proofErr w:type="spellEnd"/>
-      <w:r>
-        <w:rPr>
-          <w:i/>
-          <w:iCs/>
-          <w:color w:val="2E75B6"/>
-          <w:sz w:val="21"/>
-          <w:szCs w:val="21"/>
-        </w:rPr>
-        <w:t xml:space="preserve"> Development</w:t>
+        <w:t>Zidio Development</w:t>
       </w:r>
       <w:r>
         <w:rPr>
@@ -2071,17 +1810,8 @@
           <w:b/>
           <w:bCs/>
         </w:rPr>
-        <w:t>TensorFlow/</w:t>
-      </w:r>
-      <w:proofErr w:type="spellStart"/>
-      <w:r>
-        <w:rPr>
-          <w:b/>
-          <w:bCs/>
-        </w:rPr>
-        <w:t>Keras</w:t>
-      </w:r>
-      <w:proofErr w:type="spellEnd"/>
+        <w:t>TensorFlow/Keras</w:t>
+      </w:r>
       <w:r>
         <w:t xml:space="preserve"> — implementing </w:t>
       </w:r>
@@ -2095,7 +1825,6 @@
       <w:r>
         <w:t xml:space="preserve"> feature extraction with </w:t>
       </w:r>
-      <w:proofErr w:type="spellStart"/>
       <w:r>
         <w:rPr>
           <w:b/>
@@ -2103,7 +1832,6 @@
         </w:rPr>
         <w:t>Librosa</w:t>
       </w:r>
-      <w:proofErr w:type="spellEnd"/>
       <w:r>
         <w:t xml:space="preserve"> and an </w:t>
       </w:r>
@@ -2302,15 +2030,7 @@
         <w:t>Isolation Forest</w:t>
       </w:r>
       <w:r>
-        <w:t xml:space="preserve"> model and rule-based scoring to flag suspicious access </w:t>
-      </w:r>
-      <w:proofErr w:type="spellStart"/>
-      <w:r>
-        <w:t>behavior</w:t>
-      </w:r>
-      <w:proofErr w:type="spellEnd"/>
-      <w:r>
-        <w:t xml:space="preserve"> and trigger real-time administrator email alerts.</w:t>
+        <w:t xml:space="preserve"> model and rule-based scoring to flag suspicious access behavior and trigger real-time administrator email alerts.</w:t>
       </w:r>
     </w:p>
     <w:p>
@@ -2340,7 +2060,6 @@
       <w:pPr>
         <w:spacing w:before="140" w:after="20"/>
       </w:pPr>
-      <w:proofErr w:type="spellStart"/>
       <w:r>
         <w:rPr>
           <w:b/>
@@ -2349,18 +2068,7 @@
           <w:sz w:val="21"/>
           <w:szCs w:val="21"/>
         </w:rPr>
-        <w:t>CityPulse</w:t>
-      </w:r>
-      <w:proofErr w:type="spellEnd"/>
-      <w:r>
-        <w:rPr>
-          <w:b/>
-          <w:bCs/>
-          <w:color w:val="000000"/>
-          <w:sz w:val="21"/>
-          <w:szCs w:val="21"/>
-        </w:rPr>
-        <w:t xml:space="preserve"> — Event Recommendation Chatbot</w:t>
+        <w:t>CityPulse — Event Recommendation Chatbot</w:t>
       </w:r>
     </w:p>
     <w:p>
@@ -2379,7 +2087,6 @@
         </w:rPr>
         <w:t xml:space="preserve">Tech Stack: </w:t>
       </w:r>
-      <w:proofErr w:type="spellStart"/>
       <w:r>
         <w:rPr>
           <w:i/>
@@ -2388,62 +2095,7 @@
           <w:sz w:val="19"/>
           <w:szCs w:val="19"/>
         </w:rPr>
-        <w:t>FastAPI</w:t>
-      </w:r>
-      <w:proofErr w:type="spellEnd"/>
-      <w:r>
-        <w:rPr>
-          <w:i/>
-          <w:iCs/>
-          <w:color w:val="555555"/>
-          <w:sz w:val="19"/>
-          <w:szCs w:val="19"/>
-        </w:rPr>
-        <w:t xml:space="preserve">, Next.js, React, MongoDB, </w:t>
-      </w:r>
-      <w:proofErr w:type="spellStart"/>
-      <w:r>
-        <w:rPr>
-          <w:i/>
-          <w:iCs/>
-          <w:color w:val="555555"/>
-          <w:sz w:val="19"/>
-          <w:szCs w:val="19"/>
-        </w:rPr>
-        <w:t>LangChain</w:t>
-      </w:r>
-      <w:proofErr w:type="spellEnd"/>
-      <w:r>
-        <w:rPr>
-          <w:i/>
-          <w:iCs/>
-          <w:color w:val="555555"/>
-          <w:sz w:val="19"/>
-          <w:szCs w:val="19"/>
-        </w:rPr>
-        <w:t xml:space="preserve">, </w:t>
-      </w:r>
-      <w:proofErr w:type="spellStart"/>
-      <w:r>
-        <w:rPr>
-          <w:i/>
-          <w:iCs/>
-          <w:color w:val="555555"/>
-          <w:sz w:val="19"/>
-          <w:szCs w:val="19"/>
-        </w:rPr>
-        <w:t>OpenAI</w:t>
-      </w:r>
-      <w:proofErr w:type="spellEnd"/>
-      <w:r>
-        <w:rPr>
-          <w:i/>
-          <w:iCs/>
-          <w:color w:val="555555"/>
-          <w:sz w:val="19"/>
-          <w:szCs w:val="19"/>
-        </w:rPr>
-        <w:t xml:space="preserve"> GPT, Scrapy, Selenium</w:t>
+        <w:t>FastAPI, Next.js, React, MongoDB, LangChain, OpenAI GPT, Scrapy, Selenium</w:t>
       </w:r>
     </w:p>
     <w:p>
@@ -2458,7 +2110,6 @@
       <w:r>
         <w:t xml:space="preserve">Built a </w:t>
       </w:r>
-      <w:proofErr w:type="spellStart"/>
       <w:r>
         <w:rPr>
           <w:b/>
@@ -2466,7 +2117,6 @@
         </w:rPr>
         <w:t>FastAPI</w:t>
       </w:r>
-      <w:proofErr w:type="spellEnd"/>
       <w:r>
         <w:t xml:space="preserve"> backend and </w:t>
       </w:r>
@@ -2480,7 +2130,6 @@
       <w:r>
         <w:t xml:space="preserve"> frontend for an event recommendation chatbot with Google OAuth sign-in, MongoDB session persistence, and </w:t>
       </w:r>
-      <w:proofErr w:type="spellStart"/>
       <w:r>
         <w:rPr>
           <w:b/>
@@ -2488,7 +2137,6 @@
         </w:rPr>
         <w:t>LangChain</w:t>
       </w:r>
-      <w:proofErr w:type="spellEnd"/>
       <w:r>
         <w:t xml:space="preserve">-powered conversational flows delivering recommendations in </w:t>
       </w:r>
@@ -2515,21 +2163,12 @@
       <w:r>
         <w:t xml:space="preserve">Engineered a </w:t>
       </w:r>
-      <w:proofErr w:type="spellStart"/>
-      <w:r>
-        <w:rPr>
-          <w:b/>
-          <w:bCs/>
-        </w:rPr>
-        <w:t>LangChain</w:t>
-      </w:r>
-      <w:proofErr w:type="spellEnd"/>
-      <w:r>
-        <w:rPr>
-          <w:b/>
-          <w:bCs/>
-        </w:rPr>
-        <w:t xml:space="preserve"> RAG</w:t>
+      <w:r>
+        <w:rPr>
+          <w:b/>
+          <w:bCs/>
+        </w:rPr>
+        <w:t>LangChain RAG</w:t>
       </w:r>
       <w:r>
         <w:t xml:space="preserve"> pipeline with conversation memory, keyword and timeframe entity extraction, and preference tracking over a </w:t>
@@ -2887,27 +2526,7 @@
           <w:sz w:val="24"/>
           <w:szCs w:val="24"/>
         </w:rPr>
-        <w:t xml:space="preserve">NLP for ML with Python: Advanced NLP Using </w:t>
-      </w:r>
-      <w:proofErr w:type="spellStart"/>
-      <w:r>
-        <w:rPr>
-          <w:b/>
-          <w:bCs/>
-          <w:sz w:val="24"/>
-          <w:szCs w:val="24"/>
-        </w:rPr>
-        <w:t>spaCy</w:t>
-      </w:r>
-      <w:proofErr w:type="spellEnd"/>
-      <w:r>
-        <w:rPr>
-          <w:b/>
-          <w:bCs/>
-          <w:sz w:val="24"/>
-          <w:szCs w:val="24"/>
-        </w:rPr>
-        <w:t xml:space="preserve"> &amp; Scikit-learn</w:t>
+        <w:t>NLP for ML with Python: Advanced NLP Using spaCy &amp; Scikit-learn</w:t>
       </w:r>
       <w:r>
         <w:rPr>
@@ -3090,27 +2709,15 @@
         </w:rPr>
         <w:t xml:space="preserve">                       </w:t>
       </w:r>
-      <w:proofErr w:type="spellStart"/>
-      <w:r>
-        <w:rPr>
-          <w:i/>
-          <w:iCs/>
-          <w:color w:val="444444"/>
-          <w:sz w:val="24"/>
-          <w:szCs w:val="24"/>
-        </w:rPr>
-        <w:t>Simbiotik</w:t>
-      </w:r>
-      <w:proofErr w:type="spellEnd"/>
-      <w:r>
-        <w:rPr>
-          <w:i/>
-          <w:iCs/>
-          <w:color w:val="444444"/>
-          <w:sz w:val="24"/>
-          <w:szCs w:val="24"/>
-        </w:rPr>
-        <w:t xml:space="preserve"> Technologies</w:t>
+      <w:r>
+        <w:rPr>
+          <w:i/>
+          <w:iCs/>
+          <w:color w:val="444444"/>
+          <w:sz w:val="24"/>
+          <w:szCs w:val="24"/>
+        </w:rPr>
+        <w:t>Simbiotik Technologies</w:t>
       </w:r>
       <w:r>
         <w:rPr>
@@ -3502,7 +3109,6 @@
         </w:rPr>
         <w:t xml:space="preserve">                                      </w:t>
       </w:r>
-      <w:proofErr w:type="spellStart"/>
       <w:r>
         <w:rPr>
           <w:i/>
@@ -3513,7 +3119,6 @@
         </w:rPr>
         <w:t>HackerRank</w:t>
       </w:r>
-      <w:proofErr w:type="spellEnd"/>
       <w:r>
         <w:rPr>
           <w:i/>
@@ -3738,25 +3343,14 @@
         </w:tabs>
         <w:spacing w:before="80" w:after="20"/>
       </w:pPr>
-      <w:proofErr w:type="spellStart"/>
-      <w:r>
-        <w:rPr>
-          <w:b/>
-          <w:bCs/>
-          <w:sz w:val="21"/>
-          <w:szCs w:val="21"/>
-        </w:rPr>
-        <w:t>B.Tech</w:t>
-      </w:r>
-      <w:proofErr w:type="spellEnd"/>
-      <w:r>
-        <w:rPr>
-          <w:b/>
-          <w:bCs/>
-          <w:sz w:val="21"/>
-          <w:szCs w:val="21"/>
-        </w:rPr>
-        <w:t xml:space="preserve"> — Computer Science and Engineering</w:t>
+      <w:r>
+        <w:rPr>
+          <w:b/>
+          <w:bCs/>
+          <w:sz w:val="21"/>
+          <w:szCs w:val="21"/>
+        </w:rPr>
+        <w:t>B.Tech — Computer Science and Engineering</w:t>
       </w:r>
       <w:r>
         <w:rPr>
@@ -3802,25 +3396,14 @@
           <w:szCs w:val="21"/>
         </w:rPr>
       </w:pPr>
-      <w:proofErr w:type="spellStart"/>
-      <w:r>
-        <w:rPr>
-          <w:b/>
-          <w:bCs/>
-          <w:sz w:val="21"/>
-          <w:szCs w:val="21"/>
-        </w:rPr>
-        <w:t>Lalaji</w:t>
-      </w:r>
-      <w:proofErr w:type="spellEnd"/>
-      <w:r>
-        <w:rPr>
-          <w:b/>
-          <w:bCs/>
-          <w:sz w:val="21"/>
-          <w:szCs w:val="21"/>
-        </w:rPr>
-        <w:t xml:space="preserve"> Memorial Omega International School</w:t>
+      <w:r>
+        <w:rPr>
+          <w:b/>
+          <w:bCs/>
+          <w:sz w:val="21"/>
+          <w:szCs w:val="21"/>
+        </w:rPr>
+        <w:t>Lalaji Memorial Omega International School</w:t>
       </w:r>
       <w:r>
         <w:rPr>

</xml_diff>

<commit_message>
Update portfolio content and resume assets
</commit_message>
<xml_diff>
--- a/AKILAN-RESUME.docx
+++ b/AKILAN-RESUME.docx
@@ -42,29 +42,7 @@
           <w:sz w:val="28"/>
           <w:szCs w:val="28"/>
         </w:rPr>
-        <w:t xml:space="preserve">Backend &amp; Automation Engineer | Python | </w:t>
-      </w:r>
-      <w:proofErr w:type="spellStart"/>
-      <w:r>
-        <w:rPr>
-          <w:b/>
-          <w:bCs/>
-          <w:color w:val="1F4E79"/>
-          <w:sz w:val="28"/>
-          <w:szCs w:val="28"/>
-        </w:rPr>
-        <w:t>FastAPI</w:t>
-      </w:r>
-      <w:proofErr w:type="spellEnd"/>
-      <w:r>
-        <w:rPr>
-          <w:b/>
-          <w:bCs/>
-          <w:color w:val="1F4E79"/>
-          <w:sz w:val="28"/>
-          <w:szCs w:val="28"/>
-        </w:rPr>
-        <w:t xml:space="preserve"> | RPA | Applied AI Systems</w:t>
+        <w:t>Backend &amp; Automation Engineer | Python | FastAPI | RPA | Applied AI Systems</w:t>
       </w:r>
     </w:p>
     <w:p>
@@ -95,18 +73,8 @@
             <w:sz w:val="18"/>
             <w:szCs w:val="18"/>
           </w:rPr>
-          <w:t>linkedin.com/in/</w:t>
+          <w:t>linkedin.com/in/akilanmanikandan</w:t>
         </w:r>
-        <w:proofErr w:type="spellStart"/>
-        <w:r>
-          <w:rPr>
-            <w:rStyle w:val="Hyperlink"/>
-            <w:sz w:val="18"/>
-            <w:szCs w:val="18"/>
-          </w:rPr>
-          <w:t>akilanmanikandan</w:t>
-        </w:r>
-        <w:proofErr w:type="spellEnd"/>
       </w:hyperlink>
       <w:r>
         <w:rPr>
@@ -131,18 +99,8 @@
             <w:sz w:val="18"/>
             <w:szCs w:val="18"/>
           </w:rPr>
-          <w:t>github.com/</w:t>
+          <w:t>github.com/akilanmanikandan</w:t>
         </w:r>
-        <w:proofErr w:type="spellStart"/>
-        <w:r>
-          <w:rPr>
-            <w:rStyle w:val="Hyperlink"/>
-            <w:sz w:val="18"/>
-            <w:szCs w:val="18"/>
-          </w:rPr>
-          <w:t>akilanmanikandan</w:t>
-        </w:r>
-        <w:proofErr w:type="spellEnd"/>
         <w:r>
           <w:rPr>
             <w:rStyle w:val="Hyperlink"/>
@@ -202,31 +160,7 @@
         <w:spacing w:before="60" w:after="60"/>
       </w:pPr>
       <w:r>
-        <w:t xml:space="preserve">Backend and automation engineer with internship experience across 4 roles building production API services, RPA pipelines, and data ingestion systems that eliminated 8+ hours of daily manual effort. Shipped across Python, Java, and TypeScript using </w:t>
-      </w:r>
-      <w:proofErr w:type="spellStart"/>
-      <w:r>
-        <w:t>FastAPI</w:t>
-      </w:r>
-      <w:proofErr w:type="spellEnd"/>
-      <w:r>
-        <w:t xml:space="preserve">, Spring Boot, </w:t>
-      </w:r>
-      <w:proofErr w:type="spellStart"/>
-      <w:r>
-        <w:t>NestJS</w:t>
-      </w:r>
-      <w:proofErr w:type="spellEnd"/>
-      <w:r>
-        <w:t xml:space="preserve">, PostgreSQL, and MongoDB. Specializes in turning repetitive operational workflows into auditable, configuration-driven systems with hands-on work in applied ML, </w:t>
-      </w:r>
-      <w:proofErr w:type="spellStart"/>
-      <w:r>
-        <w:t>LangChain</w:t>
-      </w:r>
-      <w:proofErr w:type="spellEnd"/>
-      <w:r>
-        <w:t xml:space="preserve"> RAG pipelines, and campaign automation at scale.</w:t>
+        <w:t>Backend and automation engineer with internship experience across 4 roles building production API services, RPA pipelines, and data ingestion systems that eliminated 8+ hours of daily manual effort. Shipped across Python, Java, and TypeScript using FastAPI, Spring Boot, NestJS, PostgreSQL, and MongoDB. Specializes in turning repetitive operational workflows into auditable, configuration-driven systems with hands-on work in applied ML, LangChain RAG pipelines, and campaign automation at scale.</w:t>
       </w:r>
     </w:p>
     <w:p>
@@ -344,37 +278,19 @@
             </w:tcMar>
           </w:tcPr>
           <w:p>
-            <w:proofErr w:type="spellStart"/>
             <w:r>
               <w:rPr>
                 <w:sz w:val="19"/>
                 <w:szCs w:val="19"/>
               </w:rPr>
-              <w:t>FastAPI</w:t>
+              <w:t>FastAPI, Spring Boot, Flask, Django REST Framework, NestJS, Next.js, React</w:t>
             </w:r>
-            <w:proofErr w:type="spellEnd"/>
             <w:r>
               <w:rPr>
                 <w:sz w:val="19"/>
                 <w:szCs w:val="19"/>
               </w:rPr>
-              <w:t xml:space="preserve">, Spring Boot, Flask, Django REST Framework, </w:t>
-            </w:r>
-            <w:proofErr w:type="spellStart"/>
-            <w:r>
-              <w:rPr>
-                <w:sz w:val="19"/>
-                <w:szCs w:val="19"/>
-              </w:rPr>
-              <w:t>NestJS</w:t>
-            </w:r>
-            <w:proofErr w:type="spellEnd"/>
-            <w:r>
-              <w:rPr>
-                <w:sz w:val="19"/>
-                <w:szCs w:val="19"/>
-              </w:rPr>
-              <w:t>, Next.js, React</w:t>
+              <w:t>, GraphQL</w:t>
             </w:r>
           </w:p>
         </w:tc>
@@ -419,39 +335,7 @@
                 <w:sz w:val="19"/>
                 <w:szCs w:val="19"/>
               </w:rPr>
-              <w:t xml:space="preserve">Playwright, </w:t>
-            </w:r>
-            <w:proofErr w:type="spellStart"/>
-            <w:r>
-              <w:rPr>
-                <w:sz w:val="19"/>
-                <w:szCs w:val="19"/>
-              </w:rPr>
-              <w:t>PyAutoGUI</w:t>
-            </w:r>
-            <w:proofErr w:type="spellEnd"/>
-            <w:r>
-              <w:rPr>
-                <w:sz w:val="19"/>
-                <w:szCs w:val="19"/>
-              </w:rPr>
-              <w:t xml:space="preserve">, Selenium, </w:t>
-            </w:r>
-            <w:proofErr w:type="spellStart"/>
-            <w:r>
-              <w:rPr>
-                <w:sz w:val="19"/>
-                <w:szCs w:val="19"/>
-              </w:rPr>
-              <w:t>TagUI</w:t>
-            </w:r>
-            <w:proofErr w:type="spellEnd"/>
-            <w:r>
-              <w:rPr>
-                <w:sz w:val="19"/>
-                <w:szCs w:val="19"/>
-              </w:rPr>
-              <w:t>, Scrapy, n8n</w:t>
+              <w:t>Playwright, PyAutoGUI, Selenium, TagUI, Scrapy, n8n</w:t>
             </w:r>
           </w:p>
         </w:tc>
@@ -496,23 +380,7 @@
                 <w:sz w:val="19"/>
                 <w:szCs w:val="19"/>
               </w:rPr>
-              <w:t xml:space="preserve">PostgreSQL, MongoDB, Mongoose, </w:t>
-            </w:r>
-            <w:proofErr w:type="spellStart"/>
-            <w:r>
-              <w:rPr>
-                <w:sz w:val="19"/>
-                <w:szCs w:val="19"/>
-              </w:rPr>
-              <w:t>SQLAlchemy</w:t>
-            </w:r>
-            <w:proofErr w:type="spellEnd"/>
-            <w:r>
-              <w:rPr>
-                <w:sz w:val="19"/>
-                <w:szCs w:val="19"/>
-              </w:rPr>
-              <w:t>, psycopg2</w:t>
+              <w:t>PostgreSQL, MongoDB, Mongoose, SQLAlchemy, psycopg2</w:t>
             </w:r>
           </w:p>
         </w:tc>
@@ -647,23 +515,7 @@
                 <w:sz w:val="19"/>
                 <w:szCs w:val="19"/>
               </w:rPr>
-              <w:t xml:space="preserve">JWT, Passport, </w:t>
-            </w:r>
-            <w:proofErr w:type="spellStart"/>
-            <w:r>
-              <w:rPr>
-                <w:sz w:val="19"/>
-                <w:szCs w:val="19"/>
-              </w:rPr>
-              <w:t>bcrypt</w:t>
-            </w:r>
-            <w:proofErr w:type="spellEnd"/>
-            <w:r>
-              <w:rPr>
-                <w:sz w:val="19"/>
-                <w:szCs w:val="19"/>
-              </w:rPr>
-              <w:t>, AES, RSA, ABAC, OTP, MFA, TOTP</w:t>
+              <w:t>JWT, Passport, bcrypt, AES, RSA, ABAC, OTP, MFA, TOTP</w:t>
             </w:r>
           </w:p>
         </w:tc>
@@ -708,71 +560,7 @@
                 <w:sz w:val="19"/>
                 <w:szCs w:val="19"/>
               </w:rPr>
-              <w:t xml:space="preserve">TensorFlow, </w:t>
-            </w:r>
-            <w:proofErr w:type="spellStart"/>
-            <w:r>
-              <w:rPr>
-                <w:sz w:val="19"/>
-                <w:szCs w:val="19"/>
-              </w:rPr>
-              <w:t>Keras</w:t>
-            </w:r>
-            <w:proofErr w:type="spellEnd"/>
-            <w:r>
-              <w:rPr>
-                <w:sz w:val="19"/>
-                <w:szCs w:val="19"/>
-              </w:rPr>
-              <w:t xml:space="preserve">, </w:t>
-            </w:r>
-            <w:proofErr w:type="spellStart"/>
-            <w:r>
-              <w:rPr>
-                <w:sz w:val="19"/>
-                <w:szCs w:val="19"/>
-              </w:rPr>
-              <w:t>Librosa</w:t>
-            </w:r>
-            <w:proofErr w:type="spellEnd"/>
-            <w:r>
-              <w:rPr>
-                <w:sz w:val="19"/>
-                <w:szCs w:val="19"/>
-              </w:rPr>
-              <w:t xml:space="preserve">, scikit-learn, </w:t>
-            </w:r>
-            <w:proofErr w:type="spellStart"/>
-            <w:r>
-              <w:rPr>
-                <w:sz w:val="19"/>
-                <w:szCs w:val="19"/>
-              </w:rPr>
-              <w:t>LangChain</w:t>
-            </w:r>
-            <w:proofErr w:type="spellEnd"/>
-            <w:r>
-              <w:rPr>
-                <w:sz w:val="19"/>
-                <w:szCs w:val="19"/>
-              </w:rPr>
-              <w:t xml:space="preserve">, </w:t>
-            </w:r>
-            <w:proofErr w:type="spellStart"/>
-            <w:r>
-              <w:rPr>
-                <w:sz w:val="19"/>
-                <w:szCs w:val="19"/>
-              </w:rPr>
-              <w:t>OpenAI</w:t>
-            </w:r>
-            <w:proofErr w:type="spellEnd"/>
-            <w:r>
-              <w:rPr>
-                <w:sz w:val="19"/>
-                <w:szCs w:val="19"/>
-              </w:rPr>
-              <w:t xml:space="preserve"> API, Gemini API</w:t>
+              <w:t>TensorFlow, Keras, Librosa, scikit-learn, LangChain, OpenAI API, Gemini API</w:t>
             </w:r>
           </w:p>
         </w:tc>
@@ -833,6 +621,13 @@
               </w:rPr>
               <w:t>MS Office</w:t>
             </w:r>
+            <w:r>
+              <w:rPr>
+                <w:sz w:val="19"/>
+                <w:szCs w:val="19"/>
+              </w:rPr>
+              <w:t>, Docker, Linux</w:t>
+            </w:r>
           </w:p>
         </w:tc>
       </w:tr>
@@ -928,7 +723,6 @@
         </w:rPr>
         <w:t xml:space="preserve"> </w:t>
       </w:r>
-      <w:proofErr w:type="spellStart"/>
       <w:r>
         <w:rPr>
           <w:i/>
@@ -937,18 +731,7 @@
           <w:sz w:val="21"/>
           <w:szCs w:val="21"/>
         </w:rPr>
-        <w:t>Clarivium</w:t>
-      </w:r>
-      <w:proofErr w:type="spellEnd"/>
-      <w:r>
-        <w:rPr>
-          <w:i/>
-          <w:iCs/>
-          <w:color w:val="2E75B6"/>
-          <w:sz w:val="21"/>
-          <w:szCs w:val="21"/>
-        </w:rPr>
-        <w:t xml:space="preserve"> Technologies</w:t>
+        <w:t>Clarivium Technologies</w:t>
       </w:r>
     </w:p>
     <w:p>
@@ -1040,14 +823,12 @@
       <w:r>
         <w:t xml:space="preserve"> and </w:t>
       </w:r>
-      <w:proofErr w:type="spellStart"/>
       <w:r>
         <w:rPr>
           <w:rStyle w:val="Strong"/>
         </w:rPr>
         <w:t>PyAutoGUI</w:t>
       </w:r>
-      <w:proofErr w:type="spellEnd"/>
       <w:r>
         <w:t xml:space="preserve"> covering login, </w:t>
       </w:r>
@@ -1116,15 +897,7 @@
         <w:t>duplicate pipeline runs by ~90%</w:t>
       </w:r>
       <w:r>
-        <w:t xml:space="preserve"> and enabling full </w:t>
-      </w:r>
-      <w:proofErr w:type="spellStart"/>
-      <w:r>
-        <w:t>replayability</w:t>
-      </w:r>
-      <w:proofErr w:type="spellEnd"/>
-      <w:r>
-        <w:t xml:space="preserve"> of failed stages.</w:t>
+        <w:t xml:space="preserve"> and enabling full replayability of failed stages.</w:t>
       </w:r>
     </w:p>
     <w:p>
@@ -1157,15 +930,7 @@
         <w:t>n8n</w:t>
       </w:r>
       <w:r>
-        <w:t xml:space="preserve"> workflows (21 </w:t>
-      </w:r>
-      <w:proofErr w:type="spellStart"/>
-      <w:r>
-        <w:t>branchwise</w:t>
-      </w:r>
-      <w:proofErr w:type="spellEnd"/>
-      <w:r>
-        <w:t xml:space="preserve"> KPI refresh + 25 dashboard freshness monitoring) integrating </w:t>
+        <w:t xml:space="preserve"> workflows (21 branchwise KPI refresh + 25 dashboard freshness monitoring) integrating </w:t>
       </w:r>
       <w:r>
         <w:rPr>
@@ -1175,15 +940,7 @@
         <w:t>Power BI</w:t>
       </w:r>
       <w:r>
-        <w:t xml:space="preserve"> </w:t>
-      </w:r>
-      <w:proofErr w:type="spellStart"/>
-      <w:r>
-        <w:t>executeQueries</w:t>
-      </w:r>
-      <w:proofErr w:type="spellEnd"/>
-      <w:r>
-        <w:t xml:space="preserve"> API, </w:t>
+        <w:t xml:space="preserve"> executeQueries API, </w:t>
       </w:r>
       <w:r>
         <w:rPr>
@@ -1193,15 +950,7 @@
         <w:t>PostgreSQL</w:t>
       </w:r>
       <w:r>
-        <w:t xml:space="preserve"> </w:t>
-      </w:r>
-      <w:proofErr w:type="spellStart"/>
-      <w:r>
-        <w:t>upserts</w:t>
-      </w:r>
-      <w:proofErr w:type="spellEnd"/>
-      <w:r>
-        <w:t>, and notification steps replacing manual analytics validation for a 10-branch automotive client.</w:t>
+        <w:t xml:space="preserve"> upserts, and notification steps replacing manual analytics validation for a 10-branch automotive client.</w:t>
       </w:r>
     </w:p>
     <w:p>
@@ -1243,19 +992,11 @@
       <w:r>
         <w:t xml:space="preserve"> via </w:t>
       </w:r>
-      <w:proofErr w:type="spellStart"/>
-      <w:r>
-        <w:rPr>
-          <w:rStyle w:val="Strong"/>
-        </w:rPr>
-        <w:t>AiSensy</w:t>
-      </w:r>
-      <w:proofErr w:type="spellEnd"/>
-      <w:r>
-        <w:rPr>
-          <w:rStyle w:val="Strong"/>
-        </w:rPr>
-        <w:t xml:space="preserve"> BSP APIs</w:t>
+      <w:r>
+        <w:rPr>
+          <w:rStyle w:val="Strong"/>
+        </w:rPr>
+        <w:t>AiSensy BSP APIs</w:t>
       </w:r>
       <w:r>
         <w:t xml:space="preserve"> across insurance renewals, service reminders, and test-drive follow-ups cutting campaign setup time </w:t>
@@ -1320,7 +1061,6 @@
         </w:rPr>
         <w:t xml:space="preserve"> </w:t>
       </w:r>
-      <w:proofErr w:type="spellStart"/>
       <w:r>
         <w:rPr>
           <w:i/>
@@ -1331,7 +1071,6 @@
         </w:rPr>
         <w:t>CleandeskAI</w:t>
       </w:r>
-      <w:proofErr w:type="spellEnd"/>
       <w:r>
         <w:rPr>
           <w:i/>
@@ -1536,7 +1275,6 @@
         </w:rPr>
         <w:t xml:space="preserve"> </w:t>
       </w:r>
-      <w:proofErr w:type="spellStart"/>
       <w:r>
         <w:rPr>
           <w:i/>
@@ -1545,18 +1283,7 @@
           <w:sz w:val="21"/>
           <w:szCs w:val="21"/>
         </w:rPr>
-        <w:t>Simbiotik</w:t>
-      </w:r>
-      <w:proofErr w:type="spellEnd"/>
-      <w:r>
-        <w:rPr>
-          <w:i/>
-          <w:iCs/>
-          <w:color w:val="2E75B6"/>
-          <w:sz w:val="21"/>
-          <w:szCs w:val="21"/>
-        </w:rPr>
-        <w:t xml:space="preserve"> Technologies</w:t>
+        <w:t>Simbiotik Technologies</w:t>
       </w:r>
       <w:r>
         <w:rPr>
@@ -1626,14 +1353,12 @@
       <w:r>
         <w:t xml:space="preserve"> using </w:t>
       </w:r>
-      <w:proofErr w:type="spellStart"/>
       <w:r>
         <w:rPr>
           <w:rStyle w:val="Strong"/>
         </w:rPr>
         <w:t>NestJS</w:t>
       </w:r>
-      <w:proofErr w:type="spellEnd"/>
       <w:r>
         <w:t xml:space="preserve">, </w:t>
       </w:r>
@@ -1704,19 +1429,11 @@
       <w:r>
         <w:t xml:space="preserve"> with </w:t>
       </w:r>
-      <w:proofErr w:type="spellStart"/>
-      <w:r>
-        <w:rPr>
-          <w:rStyle w:val="Strong"/>
-        </w:rPr>
-        <w:t>bcrypt</w:t>
-      </w:r>
-      <w:proofErr w:type="spellEnd"/>
-      <w:r>
-        <w:rPr>
-          <w:rStyle w:val="Strong"/>
-        </w:rPr>
-        <w:t xml:space="preserve"> password hashing</w:t>
+      <w:r>
+        <w:rPr>
+          <w:rStyle w:val="Strong"/>
+        </w:rPr>
+        <w:t>bcrypt password hashing</w:t>
       </w:r>
       <w:r>
         <w:t xml:space="preserve">, </w:t>
@@ -1798,7 +1515,6 @@
         </w:rPr>
         <w:t xml:space="preserve"> </w:t>
       </w:r>
-      <w:proofErr w:type="spellStart"/>
       <w:r>
         <w:rPr>
           <w:i/>
@@ -1807,18 +1523,7 @@
           <w:sz w:val="21"/>
           <w:szCs w:val="21"/>
         </w:rPr>
-        <w:t>Zidio</w:t>
-      </w:r>
-      <w:proofErr w:type="spellEnd"/>
-      <w:r>
-        <w:rPr>
-          <w:i/>
-          <w:iCs/>
-          <w:color w:val="2E75B6"/>
-          <w:sz w:val="21"/>
-          <w:szCs w:val="21"/>
-        </w:rPr>
-        <w:t xml:space="preserve"> Development</w:t>
+        <w:t>Zidio Development</w:t>
       </w:r>
       <w:r>
         <w:rPr>
@@ -2088,15 +1793,7 @@
         <w:t>Isolation Forest model</w:t>
       </w:r>
       <w:r>
-        <w:t xml:space="preserve"> and rule-based scoring to flag suspicious access </w:t>
-      </w:r>
-      <w:proofErr w:type="spellStart"/>
-      <w:r>
-        <w:t>behavior</w:t>
-      </w:r>
-      <w:proofErr w:type="spellEnd"/>
-      <w:r>
-        <w:t xml:space="preserve"> across </w:t>
+        <w:t xml:space="preserve"> and rule-based scoring to flag suspicious access behavior across </w:t>
       </w:r>
       <w:r>
         <w:rPr>
@@ -2139,7 +1836,6 @@
       <w:pPr>
         <w:spacing w:before="140" w:after="20"/>
       </w:pPr>
-      <w:proofErr w:type="spellStart"/>
       <w:r>
         <w:rPr>
           <w:b/>
@@ -2148,18 +1844,7 @@
           <w:sz w:val="21"/>
           <w:szCs w:val="21"/>
         </w:rPr>
-        <w:t>CityPulse</w:t>
-      </w:r>
-      <w:proofErr w:type="spellEnd"/>
-      <w:r>
-        <w:rPr>
-          <w:b/>
-          <w:bCs/>
-          <w:color w:val="000000"/>
-          <w:sz w:val="21"/>
-          <w:szCs w:val="21"/>
-        </w:rPr>
-        <w:t xml:space="preserve"> — Event Recommendation Chatbot</w:t>
+        <w:t>CityPulse — Event Recommendation Chatbot</w:t>
       </w:r>
     </w:p>
     <w:p>
@@ -2178,7 +1863,6 @@
         </w:rPr>
         <w:t xml:space="preserve">Tech Stack: </w:t>
       </w:r>
-      <w:proofErr w:type="spellStart"/>
       <w:r>
         <w:rPr>
           <w:i/>
@@ -2187,62 +1871,7 @@
           <w:sz w:val="19"/>
           <w:szCs w:val="19"/>
         </w:rPr>
-        <w:t>FastAPI</w:t>
-      </w:r>
-      <w:proofErr w:type="spellEnd"/>
-      <w:r>
-        <w:rPr>
-          <w:i/>
-          <w:iCs/>
-          <w:color w:val="555555"/>
-          <w:sz w:val="19"/>
-          <w:szCs w:val="19"/>
-        </w:rPr>
-        <w:t xml:space="preserve">, Next.js, React, MongoDB, </w:t>
-      </w:r>
-      <w:proofErr w:type="spellStart"/>
-      <w:r>
-        <w:rPr>
-          <w:i/>
-          <w:iCs/>
-          <w:color w:val="555555"/>
-          <w:sz w:val="19"/>
-          <w:szCs w:val="19"/>
-        </w:rPr>
-        <w:t>LangChain</w:t>
-      </w:r>
-      <w:proofErr w:type="spellEnd"/>
-      <w:r>
-        <w:rPr>
-          <w:i/>
-          <w:iCs/>
-          <w:color w:val="555555"/>
-          <w:sz w:val="19"/>
-          <w:szCs w:val="19"/>
-        </w:rPr>
-        <w:t xml:space="preserve">, </w:t>
-      </w:r>
-      <w:proofErr w:type="spellStart"/>
-      <w:r>
-        <w:rPr>
-          <w:i/>
-          <w:iCs/>
-          <w:color w:val="555555"/>
-          <w:sz w:val="19"/>
-          <w:szCs w:val="19"/>
-        </w:rPr>
-        <w:t>OpenAI</w:t>
-      </w:r>
-      <w:proofErr w:type="spellEnd"/>
-      <w:r>
-        <w:rPr>
-          <w:i/>
-          <w:iCs/>
-          <w:color w:val="555555"/>
-          <w:sz w:val="19"/>
-          <w:szCs w:val="19"/>
-        </w:rPr>
-        <w:t xml:space="preserve"> GPT, Scrapy, Selenium</w:t>
+        <w:t>FastAPI, Next.js, React, MongoDB, LangChain, OpenAI GPT, Scrapy, Selenium</w:t>
       </w:r>
     </w:p>
     <w:p>
@@ -2257,19 +1886,11 @@
       <w:r>
         <w:t xml:space="preserve">Built a </w:t>
       </w:r>
-      <w:proofErr w:type="spellStart"/>
-      <w:r>
-        <w:rPr>
-          <w:rStyle w:val="Strong"/>
-        </w:rPr>
-        <w:t>FastAPI</w:t>
-      </w:r>
-      <w:proofErr w:type="spellEnd"/>
-      <w:r>
-        <w:rPr>
-          <w:rStyle w:val="Strong"/>
-        </w:rPr>
-        <w:t xml:space="preserve"> backend</w:t>
+      <w:r>
+        <w:rPr>
+          <w:rStyle w:val="Strong"/>
+        </w:rPr>
+        <w:t>FastAPI backend</w:t>
       </w:r>
       <w:r>
         <w:t xml:space="preserve"> and </w:t>
@@ -2292,19 +1913,11 @@
       <w:r>
         <w:t xml:space="preserve"> and a </w:t>
       </w:r>
-      <w:proofErr w:type="spellStart"/>
-      <w:r>
-        <w:rPr>
-          <w:rStyle w:val="Strong"/>
-        </w:rPr>
-        <w:t>LangChain</w:t>
-      </w:r>
-      <w:proofErr w:type="spellEnd"/>
-      <w:r>
-        <w:rPr>
-          <w:rStyle w:val="Strong"/>
-        </w:rPr>
-        <w:t xml:space="preserve"> RAG pipeline</w:t>
+      <w:r>
+        <w:rPr>
+          <w:rStyle w:val="Strong"/>
+        </w:rPr>
+        <w:t>LangChain RAG pipeline</w:t>
       </w:r>
       <w:r>
         <w:t xml:space="preserve"> over a </w:t>
@@ -2668,27 +2281,7 @@
           <w:sz w:val="22"/>
           <w:szCs w:val="22"/>
         </w:rPr>
-        <w:t xml:space="preserve">NLP for ML with Python: Advanced NLP Using </w:t>
-      </w:r>
-      <w:proofErr w:type="spellStart"/>
-      <w:r>
-        <w:rPr>
-          <w:b/>
-          <w:bCs/>
-          <w:sz w:val="22"/>
-          <w:szCs w:val="22"/>
-        </w:rPr>
-        <w:t>spaCy</w:t>
-      </w:r>
-      <w:proofErr w:type="spellEnd"/>
-      <w:r>
-        <w:rPr>
-          <w:b/>
-          <w:bCs/>
-          <w:sz w:val="22"/>
-          <w:szCs w:val="22"/>
-        </w:rPr>
-        <w:t xml:space="preserve"> &amp; Scikit-learn</w:t>
+        <w:t>NLP for ML with Python: Advanced NLP Using spaCy &amp; Scikit-learn</w:t>
       </w:r>
       <w:r>
         <w:rPr>
@@ -2871,7 +2464,6 @@
         </w:rPr>
         <w:t xml:space="preserve">                     </w:t>
       </w:r>
-      <w:proofErr w:type="spellStart"/>
       <w:r>
         <w:rPr>
           <w:i/>
@@ -2880,18 +2472,7 @@
           <w:sz w:val="22"/>
           <w:szCs w:val="22"/>
         </w:rPr>
-        <w:t>Simbiotik</w:t>
-      </w:r>
-      <w:proofErr w:type="spellEnd"/>
-      <w:r>
-        <w:rPr>
-          <w:i/>
-          <w:iCs/>
-          <w:color w:val="444444"/>
-          <w:sz w:val="22"/>
-          <w:szCs w:val="22"/>
-        </w:rPr>
-        <w:t xml:space="preserve"> Technologies</w:t>
+        <w:t>Simbiotik Technologies</w:t>
       </w:r>
       <w:r>
         <w:rPr>
@@ -2959,27 +2540,14 @@
         </w:tabs>
         <w:spacing w:before="80"/>
       </w:pPr>
-      <w:proofErr w:type="spellStart"/>
-      <w:proofErr w:type="gramStart"/>
-      <w:r>
-        <w:rPr>
-          <w:b/>
-          <w:bCs/>
-          <w:sz w:val="21"/>
-          <w:szCs w:val="21"/>
-        </w:rPr>
-        <w:t>B.Tech</w:t>
-      </w:r>
-      <w:proofErr w:type="spellEnd"/>
-      <w:proofErr w:type="gramEnd"/>
-      <w:r>
-        <w:rPr>
-          <w:b/>
-          <w:bCs/>
-          <w:sz w:val="21"/>
-          <w:szCs w:val="21"/>
-        </w:rPr>
-        <w:t xml:space="preserve"> — Computer Science and Engineering</w:t>
+      <w:r>
+        <w:rPr>
+          <w:b/>
+          <w:bCs/>
+          <w:sz w:val="21"/>
+          <w:szCs w:val="21"/>
+        </w:rPr>
+        <w:t>B.Tech — Computer Science and Engineering</w:t>
       </w:r>
       <w:r>
         <w:rPr>
@@ -3005,42 +2573,37 @@
         </w:rPr>
         <w:t>SRM Institute of Science and Technology</w:t>
       </w:r>
-    </w:p>
-    <w:p>
-      <w:pPr>
+      <w:r>
         <w:rPr>
           <w:color w:val="444444"/>
         </w:rPr>
-      </w:pPr>
-    </w:p>
-    <w:p>
-      <w:pPr>
-        <w:rPr>
-          <w:b/>
-          <w:bCs/>
-          <w:sz w:val="21"/>
-          <w:szCs w:val="21"/>
-        </w:rPr>
-      </w:pPr>
-      <w:proofErr w:type="spellStart"/>
-      <w:r>
-        <w:rPr>
-          <w:b/>
-          <w:bCs/>
-          <w:sz w:val="21"/>
-          <w:szCs w:val="21"/>
-        </w:rPr>
-        <w:t>Lalaji</w:t>
-      </w:r>
-      <w:proofErr w:type="spellEnd"/>
-      <w:r>
-        <w:rPr>
-          <w:b/>
-          <w:bCs/>
-          <w:sz w:val="21"/>
-          <w:szCs w:val="21"/>
-        </w:rPr>
-        <w:t xml:space="preserve"> Memorial Omega International School</w:t>
+        <w:t xml:space="preserve"> | CGPA: 8.35/10</w:t>
+      </w:r>
+    </w:p>
+    <w:p>
+      <w:pPr>
+        <w:rPr>
+          <w:color w:val="444444"/>
+        </w:rPr>
+      </w:pPr>
+    </w:p>
+    <w:p>
+      <w:pPr>
+        <w:rPr>
+          <w:b/>
+          <w:bCs/>
+          <w:sz w:val="21"/>
+          <w:szCs w:val="21"/>
+        </w:rPr>
+      </w:pPr>
+      <w:r>
+        <w:rPr>
+          <w:b/>
+          <w:bCs/>
+          <w:sz w:val="21"/>
+          <w:szCs w:val="21"/>
+        </w:rPr>
+        <w:t>Lalaji Memorial Omega International School</w:t>
       </w:r>
       <w:r>
         <w:rPr>
@@ -3129,6 +2692,12 @@
         </w:rPr>
         <w:t>CLASS XII (CBSE)</w:t>
       </w:r>
+      <w:r>
+        <w:rPr>
+          <w:color w:val="444444"/>
+        </w:rPr>
+        <w:t xml:space="preserve"> | Percentage: 70%</w:t>
+      </w:r>
     </w:p>
     <w:p/>
     <w:p>
@@ -3265,6 +2834,30 @@
           <w:color w:val="444444"/>
         </w:rPr>
         <w:t>CLASS X (CBSE)</w:t>
+      </w:r>
+      <w:r>
+        <w:rPr>
+          <w:color w:val="444444"/>
+        </w:rPr>
+        <w:t xml:space="preserve"> </w:t>
+      </w:r>
+      <w:r>
+        <w:rPr>
+          <w:color w:val="444444"/>
+        </w:rPr>
+        <w:t xml:space="preserve">| Percentage: </w:t>
+      </w:r>
+      <w:r>
+        <w:rPr>
+          <w:color w:val="444444"/>
+        </w:rPr>
+        <w:t>84</w:t>
+      </w:r>
+      <w:r>
+        <w:rPr>
+          <w:color w:val="444444"/>
+        </w:rPr>
+        <w:t>%</w:t>
       </w:r>
     </w:p>
     <w:sectPr>

</xml_diff>